<commit_message>
Update README, D3 and the D6 report for Arabic and the language menu
- README: the language section covers English, Shona and Arabic, the
  language menu and the right-to-left layout; 231 tests
- D3 Section 10: same updates as D4's Appendix C, including new
  screenshots and an Arabic dashboard figure
- D6 final report: every mention of the English/Shona switch now
  describes the three languages and the menu; 231 tests, 27
  usability/localisation tests, 3 interface languages; TOC page fixed

Co-Authored-By: Claude Opus 5.5 <noreply@anthropic.com>
Claude-Session: https://claude.ai/code/session_01BLVAgZrQBMgC6fgji1xmot
</commit_message>
<xml_diff>
--- a/docs/ABDURRAHMAAN_IT401_DEL_3.docx
+++ b/docs/ABDURRAHMAAN_IT401_DEL_3.docx
@@ -2166,7 +2166,7 @@
           <w:i/>
           <w:color w:val="1E293B"/>
         </w:rPr>
-        <w:t xml:space="preserve">Note: this document records RentalPro at Deliverable 3. Section 10 summarises what has changed since — including the current figures (18 tables, 226 tests, 82% coverage), the redesigned interface, the English/Shona language switch and the Harare demonstration data.</w:t>
+        <w:t xml:space="preserve">Note: this document records RentalPro at Deliverable 3. Section 10 summarises what has changed since — including the current figures (18 tables, 231 tests, 82% coverage), the redesigned interface, English, Shona and Arabic interface languages chosen from a language menu (with a right-to-left layout for Arabic) and the Harare demonstration data.</w:t>
       </w:r>
     </w:p>
     <w:p>
@@ -22349,7 +22349,7 @@
         <w:rPr>
           <w:color w:val="1E293B"/>
         </w:rPr>
-        <w:t xml:space="preserve">This section brings the document up to date. The rest of the document describes RentalPro as it stood at Deliverable 3, and its figures are deliberately left as they were at that time. Since then the system has gained a billing engine, a property map, a redesigned interface, an English/Shona language switch and Harare demonstration data. Each change was made additively, behind the existing test suite, with new tests of its own.</w:t>
+        <w:t xml:space="preserve">This section brings the document up to date. The rest of the document describes RentalPro as it stood at Deliverable 3, and its figures are deliberately left as they were at that time. Since then the system has gained a billing engine, a property map, a redesigned interface, English, Shona and Arabic interface languages and Harare demonstration data. Each change was made additively, behind the existing test suite, with new tests of its own.</w:t>
       </w:r>
     </w:p>
     <w:p>
@@ -22775,7 +22775,7 @@
                 <w:sz w:val="18"/>
                 <w:szCs w:val="18"/>
               </w:rPr>
-              <w:t xml:space="preserve">English / Shona</w:t>
+              <w:t xml:space="preserve">Languages</w:t>
             </w:r>
           </w:p>
         </w:tc>
@@ -22804,7 +22804,7 @@
                 <w:sz w:val="18"/>
                 <w:szCs w:val="18"/>
               </w:rPr>
-              <w:t xml:space="preserve">An EN | SN switch in the top bar and on the login page; a small translator (backend/i18n.py) with an English fallback; the choice survives logging in and out. Names and places are never translated.</w:t>
+              <w:t xml:space="preserve">A language menu in the top bar and on the login page shows the current language and opens a list of English, ChiShona and Arabic; a small translator (backend/i18n.py) with an English fallback; Arabic pages switch to a right-to-left layout; the choice survives logging in and out. Names and places are never translated.</w:t>
             </w:r>
           </w:p>
         </w:tc>
@@ -22833,7 +22833,7 @@
                 <w:sz w:val="18"/>
                 <w:szCs w:val="18"/>
               </w:rPr>
-              <w:t xml:space="preserve">9</w:t>
+              <w:t xml:space="preserve">14</w:t>
             </w:r>
           </w:p>
         </w:tc>
@@ -23592,7 +23592,7 @@
                 <w:sz w:val="18"/>
                 <w:szCs w:val="18"/>
               </w:rPr>
-              <w:t xml:space="preserve">226</w:t>
+              <w:t xml:space="preserve">231</w:t>
             </w:r>
           </w:p>
         </w:tc>
@@ -23770,7 +23770,7 @@
                 <w:sz w:val="18"/>
                 <w:szCs w:val="18"/>
               </w:rPr>
-              <w:t xml:space="preserve">2 (English, Shona)</w:t>
+              <w:t xml:space="preserve">3 (English, Shona, Arabic)</w:t>
             </w:r>
           </w:p>
         </w:tc>
@@ -23789,7 +23789,7 @@
         <w:rPr>
           <w:color w:val="1E293B"/>
         </w:rPr>
-        <w:t xml:space="preserve">All 226 tests pass with no failures, and the suite still runs entirely offline, with no paid external account needed.</w:t>
+        <w:t xml:space="preserve">All 231 tests pass with no failures, and the suite still runs entirely offline, with no paid external account needed.</w:t>
       </w:r>
     </w:p>
     <w:p>
@@ -23811,7 +23811,7 @@
         <w:rPr>
           <w:color w:val="1E293B"/>
         </w:rPr>
-        <w:t xml:space="preserve">The SRS described multi-language support as Arabic and English. Because RentalPro's intended users are landlords, managers and tenants in Harare, Shona — the most widely spoken language there — was implemented as the second language instead. The design is language-neutral, so adding another language, Arabic included, only needs another phrase table.</w:t>
+        <w:t xml:space="preserve">The SRS described multi-language support as Arabic and English. Both are now implemented, together with Shona. Shona, the most widely spoken language in Harare, serves the landlords, managers and tenants the system was built for; Arabic, the second language the SRS named, serves Arabic-speaking residents and property owners in Zimbabwe. Each language is only another phrase table, so a further language, such as Ndebele, can be added the same way.</w:t>
       </w:r>
     </w:p>
     <w:p>
@@ -23834,7 +23834,7 @@
         <w:rPr>
           <w:color w:val="1E293B"/>
         </w:rPr>
-        <w:t xml:space="preserve">Templates wrap interface text in _("…"); backend/i18n.py looks each phrase up in a Shona table and falls back to English for anything not yet translated, so the app works at every stage of translation.</w:t>
+        <w:t xml:space="preserve">Templates wrap interface text in _("…"); backend/i18n.py looks each phrase up in the table for the chosen language (the Shona and Arabic tables hold the same 98 phrases) and falls back to English for anything not yet translated, so the app works at every stage of translation.</w:t>
       </w:r>
     </w:p>
     <w:p>
@@ -23851,13 +23851,36 @@
           <w:bCs/>
           <w:color w:val="1E293B"/>
         </w:rPr>
-        <w:t xml:space="preserve">Switching: </w:t>
+        <w:t xml:space="preserve">Right-to-left layout: </w:t>
       </w:r>
       <w:r>
         <w:rPr>
           <w:color w:val="1E293B"/>
         </w:rPr>
-        <w:t xml:space="preserve">An EN | SN switch in the top bar and on the login page stores the choice in the session; it survives logging in and out, and the switch's return address is checked so it cannot redirect off-site.</w:t>
+        <w:t xml:space="preserve">Arabic is written from right to left, so an Arabic page is marked dir="rtl" and the browser mirrors the layout: the navigation starts from the right and table columns read from right to left (see the Arabic dashboard in Section 10.4), and on the login page the RentalPro name and the language menu swap corners. The stylesheet aligns text to the start of the line rather than to a fixed left or right, so one stylesheet serves both directions. English and Shona stay left to right.</w:t>
+      </w:r>
+    </w:p>
+    <w:p>
+      <w:pPr>
+        <w:numPr>
+          <w:ilvl w:val="0"/>
+          <w:numId w:val="1"/>
+        </w:numPr>
+        <w:spacing w:after="60"/>
+      </w:pPr>
+      <w:r>
+        <w:rPr>
+          <w:b/>
+          <w:bCs/>
+          <w:color w:val="1E293B"/>
+        </w:rPr>
+        <w:t xml:space="preserve">Choosing a language: </w:t>
+      </w:r>
+      <w:r>
+        <w:rPr>
+          <w:color w:val="1E293B"/>
+        </w:rPr>
+        <w:t xml:space="preserve">A language button in the top bar and on the login page shows the current language; clicking its arrow opens a vertical list of English, ChiShona and Arabic, each written in its own language. The list closes on a click elsewhere or the Escape key. The choice is stored in the session and survives logging in and out, and the menu’s return address is checked so it cannot redirect off-site.</w:t>
       </w:r>
     </w:p>
     <w:p>
@@ -23903,7 +23926,30 @@
         <w:rPr>
           <w:color w:val="1E293B"/>
         </w:rPr>
-        <w:t xml:space="preserve">Property names, addresses, suburbs, cities and people's names are data, not interface text, and read the same in both languages; a test fails if a Harare place name is ever altered or given a Shona entry.</w:t>
+        <w:t xml:space="preserve">Property names, addresses, suburbs, cities and people’s names are data, not interface text, and read the same in every language; a test fails if a Harare place name is altered in Shona or Arabic, or given an entry in either phrase table.</w:t>
+      </w:r>
+    </w:p>
+    <w:p>
+      <w:pPr>
+        <w:numPr>
+          <w:ilvl w:val="0"/>
+          <w:numId w:val="1"/>
+        </w:numPr>
+        <w:spacing w:after="60"/>
+      </w:pPr>
+      <w:r>
+        <w:rPr>
+          <w:b/>
+          <w:bCs/>
+          <w:color w:val="1E293B"/>
+        </w:rPr>
+        <w:t xml:space="preserve">Tests: </w:t>
+      </w:r>
+      <w:r>
+        <w:rPr>
+          <w:color w:val="1E293B"/>
+        </w:rPr>
+        <w:t xml:space="preserve">Fourteen tests cover the languages: switching to Shona and to Arabic, the right-to-left direction for Arabic only, the choice surviving login, the tenant portal in Shona and in Arabic, the language menu, unknown language codes, off-site redirects, placeholders kept in every translation, Arabic covering every Shona phrase, and place names.</w:t>
       </w:r>
     </w:p>
     <w:p>
@@ -23926,7 +23972,7 @@
         <w:rPr>
           <w:color w:val="1E293B"/>
         </w:rPr>
-        <w:t xml:space="preserve">The Shona wording has not yet been reviewed by a native speaker.</w:t>
+        <w:t xml:space="preserve">The Shona and Arabic wording has not yet been reviewed by native speakers.</w:t>
       </w:r>
     </w:p>
     <w:p>
@@ -23951,7 +23997,7 @@
           <wp:inline distT="0" distB="0" distL="0" distR="0">
             <wp:extent cx="5943600" cy="3714750"/>
             <wp:effectExtent t="0" r="0" b="0" l="0"/>
-            <wp:docPr id="900" name="Picture 900" descr="RentalPro login page over a photograph of the Harare skyline, with an EN | SN switch"/>
+            <wp:docPr id="900" name="Picture 900" descr="RentalPro login page over a photograph of the Harare skyline, with the language menu opened"/>
             <wp:cNvGraphicFramePr>
               <a:graphicFrameLocks xmlns:a="http://schemas.openxmlformats.org/drawingml/2006/main" noChangeAspect="1"/>
             </wp:cNvGraphicFramePr>
@@ -23959,7 +24005,7 @@
               <a:graphicData uri="http://schemas.openxmlformats.org/drawingml/2006/picture">
                 <pic:pic xmlns:pic="http://schemas.openxmlformats.org/drawingml/2006/picture">
                   <pic:nvPicPr>
-                    <pic:cNvPr id="900" name="Picture 900" descr="RentalPro login page over a photograph of the Harare skyline, with an EN | SN switch"/>
+                    <pic:cNvPr id="900" name="Picture 900" descr="RentalPro login page over a photograph of the Harare skyline, with the language menu opened"/>
                     <pic:cNvPicPr>
                       <a:picLocks noChangeAspect="1"/>
                     </pic:cNvPicPr>
@@ -24003,7 +24049,7 @@
           <w:sz w:val="18"/>
           <w:szCs w:val="18"/>
         </w:rPr>
-        <w:t xml:space="preserve">Figure: The login page — Harare skyline, translucent card, EN | SN switch</w:t>
+        <w:t xml:space="preserve">Figure: The login page — Harare skyline, translucent card and the language menu, opened</w:t>
       </w:r>
     </w:p>
     <w:p>
@@ -24070,6 +24116,72 @@
           <w:szCs w:val="18"/>
         </w:rPr>
         <w:t xml:space="preserve">Figure: The portfolio dashboard in Shona — names and places stay as entered</w:t>
+      </w:r>
+    </w:p>
+    <w:p>
+      <w:pPr>
+        <w:keepNext/>
+        <w:spacing w:after="0" w:before="160"/>
+        <w:jc w:val="center"/>
+      </w:pPr>
+      <w:r>
+        <w:drawing>
+          <wp:inline distT="0" distB="0" distL="0" distR="0">
+            <wp:extent cx="5943600" cy="3714750"/>
+            <wp:effectExtent t="0" r="0" b="0" l="0"/>
+            <wp:docPr id="902" name="Picture 902" descr="The portfolio dashboard shown in Arabic, right to left, with the language menu open"/>
+            <wp:cNvGraphicFramePr>
+              <a:graphicFrameLocks xmlns:a="http://schemas.openxmlformats.org/drawingml/2006/main" noChangeAspect="1"/>
+            </wp:cNvGraphicFramePr>
+            <a:graphic xmlns:a="http://schemas.openxmlformats.org/drawingml/2006/main">
+              <a:graphicData uri="http://schemas.openxmlformats.org/drawingml/2006/picture">
+                <pic:pic xmlns:pic="http://schemas.openxmlformats.org/drawingml/2006/picture">
+                  <pic:nvPicPr>
+                    <pic:cNvPr id="902" name="Picture 902" descr="The portfolio dashboard shown in Arabic, right to left, with the language menu open"/>
+                    <pic:cNvPicPr>
+                      <a:picLocks noChangeAspect="1"/>
+                    </pic:cNvPicPr>
+                  </pic:nvPicPr>
+                  <pic:blipFill>
+                    <a:blip r:embed="rId902"/>
+                    <a:stretch>
+                      <a:fillRect/>
+                    </a:stretch>
+                  </pic:blipFill>
+                  <pic:spPr>
+                    <a:xfrm>
+                      <a:off x="0" y="0"/>
+                      <a:ext cx="5943600" cy="3714750"/>
+                    </a:xfrm>
+                    <a:prstGeom prst="rect">
+                      <a:avLst/>
+                    </a:prstGeom>
+                    <a:ln w="9525">
+                      <a:solidFill>
+                        <a:srgbClr val="CBD5E1"/>
+                      </a:solidFill>
+                    </a:ln>
+                  </pic:spPr>
+                </pic:pic>
+              </a:graphicData>
+            </a:graphic>
+          </wp:inline>
+        </w:drawing>
+      </w:r>
+    </w:p>
+    <w:p>
+      <w:pPr>
+        <w:spacing w:before="80" w:after="200"/>
+        <w:jc w:val="center"/>
+      </w:pPr>
+      <w:r>
+        <w:rPr>
+          <w:i/>
+          <w:color w:val="475569"/>
+          <w:sz w:val="18"/>
+          <w:szCs w:val="18"/>
+        </w:rPr>
+        <w:t xml:space="preserve">Figure: The portfolio dashboard in Arabic — the layout reads right to left and the language menu is open</w:t>
       </w:r>
     </w:p>
     <w:p>

</xml_diff>

<commit_message>
Update the deliverables for full Arabic and production hardening
- UI walkthrough: re-shot from the running app (amounts with currency)
  plus four new pages: tenant profile, statement and maintenance summary
  in Arabic, and an Arabic PDF statement (25 pages)
- Demo video re-recorded (2:54): the same tour with USD amounts, then
  every page in Arabic, an Arabic payment confirmation and Arabic PDF
- Deck: new slide on full Arabic and hardening, 298 tests / 85% coverage,
  security controls, architecture and future work; renumbered to 19
- Presentation video rebuilt from the deck and notes (17:38)
- D6 report: new sections 3.6 and 5.5, updated figures, tables, testing,
  challenges, conclusion and recommendations, with the TOC extended
- D3, D4, D5 and README: current figures (298 tests, 85% coverage)

Co-Authored-By: Claude Opus 5.5 <noreply@anthropic.com>
Claude-Session: https://claude.ai/code/session_01Ae7GFufZcC1fFQLcjKeCLN
</commit_message>
<xml_diff>
--- a/docs/ABDURRAHMAAN_IT401_DEL_3.docx
+++ b/docs/ABDURRAHMAAN_IT401_DEL_3.docx
@@ -2166,7 +2166,7 @@
           <w:i/>
           <w:color w:val="1E293B"/>
         </w:rPr>
-        <w:t xml:space="preserve">Note: this document records RentalPro at Deliverable 3. Section 10 summarises what has changed since — including the current figures (18 tables, 244 tests, 83% coverage), the redesigned interface, English, Shona and Arabic interface languages chosen from a language menu (with a right-to-left layout for Arabic) and the Harare demonstration data.</w:t>
+        <w:t>Note: this document records RentalPro at Deliverable 3. Section 10 summarises what has changed since — including the current figures (18 tables, 298 tests, 85% coverage), the redesigned interface, English, Shona and Arabic interface languages chosen from a language menu (with a right-to-left layout for Arabic) and the Harare demonstration data. Since then, Arabic has been extended to every screen, message, email, SMS and PDF, every amount shows its currency, and the system has been hardened for production with security headers, a required secret key, Alembic database migrations and optional S3 file storage (see the Deliverable 6 final report, Section 3.6).</w:t>
       </w:r>
     </w:p>
     <w:p>
@@ -23681,7 +23681,7 @@
                 <w:sz w:val="18"/>
                 <w:szCs w:val="18"/>
               </w:rPr>
-              <w:t xml:space="preserve">244</w:t>
+              <w:t>298</w:t>
             </w:r>
           </w:p>
         </w:tc>
@@ -23770,7 +23770,7 @@
                 <w:sz w:val="18"/>
                 <w:szCs w:val="18"/>
               </w:rPr>
-              <w:t xml:space="preserve">83%</w:t>
+              <w:t>85%</w:t>
             </w:r>
           </w:p>
         </w:tc>
@@ -23878,7 +23878,7 @@
         <w:rPr>
           <w:color w:val="1E293B"/>
         </w:rPr>
-        <w:t xml:space="preserve">All 244 tests pass with no failures, and the suite still runs entirely offline, with no paid external account needed.</w:t>
+        <w:t>All 298 tests pass with no failures, and the suite still runs entirely offline, with no paid external account needed.</w:t>
       </w:r>
     </w:p>
     <w:p>

</xml_diff>

<commit_message>
Correct the current-figures tables in D3 and D4
The "Now" column still showed 39 templates (now 40), 17 test modules in
D4 (now 22) and a September 2026 heading. The columns recording the
state at Deliverable 3 and Deliverable 5 are unchanged.

Co-Authored-By: Claude Opus 5.5 <noreply@anthropic.com>
Claude-Session: https://claude.ai/code/session_01Ae7GFufZcC1fFQLcjKeCLN
</commit_message>
<xml_diff>
--- a/docs/ABDURRAHMAAN_IT401_DEL_3.docx
+++ b/docs/ABDURRAHMAAN_IT401_DEL_3.docx
@@ -23325,7 +23325,7 @@
                 <w:sz w:val="18"/>
                 <w:szCs w:val="18"/>
               </w:rPr>
-              <w:t xml:space="preserve">Now (September 2026)</w:t>
+              <w:t>Now (October 2026)</w:t>
             </w:r>
           </w:p>
         </w:tc>
@@ -23503,7 +23503,7 @@
                 <w:sz w:val="18"/>
                 <w:szCs w:val="18"/>
               </w:rPr>
-              <w:t xml:space="preserve">39</w:t>
+              <w:t>40</w:t>
             </w:r>
           </w:p>
         </w:tc>

</xml_diff>

<commit_message>
Make every deliverable record its own point in time, and agree on the facts
D3 and D4 had been rewritten after Deliverable 5 while still claiming to
record Deliverables 3 and 4. Each is now its original as-submitted text
(93 tests, 77% coverage, 31 templates), followed by one clearly marked
'Updates Since' section with a correct 'At Deliverable N' column and the
current figures. D3's table of contents now shows real page numbers.

The D6 report, deck and presentation video now count Deliverable 5's
gaps as eleven, matching the D5 report (unit editing and lease document
download had been left out). D5 shows the 77% coverage it had before
Deliverable 5, and no document says D3 or D4 were rewritten any more.

Co-Authored-By: Claude Opus 5.5 <noreply@anthropic.com>
Claude-Session: https://claude.ai/code/session_01Ae7GFufZcC1fFQLcjKeCLN
</commit_message>
<xml_diff>
--- a/docs/ABDURRAHMAAN_IT401_DEL_3.docx
+++ b/docs/ABDURRAHMAAN_IT401_DEL_3.docx
@@ -711,7 +711,7 @@
                 <w:sz w:val="18"/>
                 <w:szCs w:val="18"/>
               </w:rPr>
-              <w:t>124 passed · 0 failed · 79% code coverage</w:t>
+              <w:t>93 passed · 0 failed · 77% code coverage</w:t>
             </w:r>
           </w:p>
         </w:tc>
@@ -887,7 +887,7 @@
             <w:noProof/>
             <w:color w:val="0F172A"/>
           </w:rPr>
-          <w:t>1</w:t>
+          <w:t>4</w:t>
         </w:r>
         <w:r>
           <w:rPr>
@@ -923,7 +923,7 @@
             <w:noProof/>
             <w:color w:val="0F172A"/>
           </w:rPr>
-          <w:t>1</w:t>
+          <w:t>5</w:t>
         </w:r>
         <w:r>
           <w:rPr>
@@ -962,7 +962,7 @@
             <w:sz w:val="19"/>
             <w:szCs w:val="19"/>
           </w:rPr>
-          <w:t>1</w:t>
+          <w:t>5</w:t>
         </w:r>
         <w:r>
           <w:rPr>
@@ -1002,7 +1002,7 @@
             <w:sz w:val="19"/>
             <w:szCs w:val="19"/>
           </w:rPr>
-          <w:t>1</w:t>
+          <w:t>6</w:t>
         </w:r>
         <w:r>
           <w:rPr>
@@ -1042,7 +1042,7 @@
             <w:sz w:val="19"/>
             <w:szCs w:val="19"/>
           </w:rPr>
-          <w:t>1</w:t>
+          <w:t>6</w:t>
         </w:r>
         <w:r>
           <w:rPr>
@@ -1079,7 +1079,7 @@
             <w:noProof/>
             <w:color w:val="0F172A"/>
           </w:rPr>
-          <w:t>1</w:t>
+          <w:t>8</w:t>
         </w:r>
         <w:r>
           <w:rPr>
@@ -1103,7 +1103,7 @@
             <w:b/>
             <w:color w:val="0F172A"/>
           </w:rPr>
-          <w:t>4. Frontend — 35 Jinja2 HTML Templates</w:t>
+          <w:t>4. Frontend — 31 Jinja2 HTML Templates</w:t>
           <w:tab/>
           <w:fldChar w:fldCharType="begin"/>
           <w:instrText xml:space="preserve"> PAGEREF _Toc0000007 \h </w:instrText>
@@ -1115,7 +1115,7 @@
             <w:noProof/>
             <w:color w:val="0F172A"/>
           </w:rPr>
-          <w:t>1</w:t>
+          <w:t>10</w:t>
         </w:r>
         <w:r>
           <w:rPr>
@@ -1139,7 +1139,7 @@
             <w:b/>
             <w:color w:val="0F172A"/>
           </w:rPr>
-          <w:t>5. Automated Test Suite — 124 Tests, 79% Coverage</w:t>
+          <w:t>5. Automated Test Suite — 93 Tests, 77% Coverage</w:t>
           <w:tab/>
           <w:fldChar w:fldCharType="begin"/>
           <w:instrText xml:space="preserve"> PAGEREF _Toc0000008 \h </w:instrText>
@@ -1151,7 +1151,7 @@
             <w:noProof/>
             <w:color w:val="0F172A"/>
           </w:rPr>
-          <w:t>1</w:t>
+          <w:t>12</w:t>
         </w:r>
         <w:r>
           <w:rPr>
@@ -1190,7 +1190,7 @@
             <w:sz w:val="19"/>
             <w:szCs w:val="19"/>
           </w:rPr>
-          <w:t>1</w:t>
+          <w:t>12</w:t>
         </w:r>
         <w:r>
           <w:rPr>
@@ -1230,7 +1230,7 @@
             <w:sz w:val="19"/>
             <w:szCs w:val="19"/>
           </w:rPr>
-          <w:t>1</w:t>
+          <w:t>13</w:t>
         </w:r>
         <w:r>
           <w:rPr>
@@ -1270,7 +1270,7 @@
             <w:sz w:val="19"/>
             <w:szCs w:val="19"/>
           </w:rPr>
-          <w:t>1</w:t>
+          <w:t>14</w:t>
         </w:r>
         <w:r>
           <w:rPr>
@@ -1307,7 +1307,7 @@
             <w:noProof/>
             <w:color w:val="0F172A"/>
           </w:rPr>
-          <w:t>1</w:t>
+          <w:t>15</w:t>
         </w:r>
         <w:r>
           <w:rPr>
@@ -1343,7 +1343,7 @@
             <w:noProof/>
             <w:color w:val="0F172A"/>
           </w:rPr>
-          <w:t>1</w:t>
+          <w:t>16</w:t>
         </w:r>
         <w:r>
           <w:rPr>
@@ -1382,7 +1382,7 @@
             <w:sz w:val="19"/>
             <w:szCs w:val="19"/>
           </w:rPr>
-          <w:t>1</w:t>
+          <w:t>16</w:t>
         </w:r>
         <w:r>
           <w:rPr>
@@ -1422,7 +1422,7 @@
             <w:sz w:val="19"/>
             <w:szCs w:val="19"/>
           </w:rPr>
-          <w:t>1</w:t>
+          <w:t>16</w:t>
         </w:r>
         <w:r>
           <w:rPr>
@@ -1462,7 +1462,7 @@
             <w:sz w:val="19"/>
             <w:szCs w:val="19"/>
           </w:rPr>
-          <w:t>1</w:t>
+          <w:t>17</w:t>
         </w:r>
         <w:r>
           <w:rPr>
@@ -1499,7 +1499,7 @@
             <w:noProof/>
             <w:color w:val="0F172A"/>
           </w:rPr>
-          <w:t>1</w:t>
+          <w:t>18</w:t>
         </w:r>
         <w:r>
           <w:rPr>
@@ -1538,7 +1538,7 @@
             <w:sz w:val="19"/>
             <w:szCs w:val="19"/>
           </w:rPr>
-          <w:t>1</w:t>
+          <w:t>18</w:t>
         </w:r>
         <w:r>
           <w:rPr>
@@ -1578,7 +1578,7 @@
             <w:sz w:val="19"/>
             <w:szCs w:val="19"/>
           </w:rPr>
-          <w:t>1</w:t>
+          <w:t>19</w:t>
         </w:r>
         <w:r>
           <w:rPr>
@@ -1618,7 +1618,7 @@
             <w:sz w:val="19"/>
             <w:szCs w:val="19"/>
           </w:rPr>
-          <w:t>1</w:t>
+          <w:t>19</w:t>
         </w:r>
         <w:r>
           <w:rPr>
@@ -1658,7 +1658,7 @@
             <w:sz w:val="19"/>
             <w:szCs w:val="19"/>
           </w:rPr>
-          <w:t>1</w:t>
+          <w:t>20</w:t>
         </w:r>
         <w:r>
           <w:rPr>
@@ -1695,7 +1695,7 @@
             <w:noProof/>
             <w:color w:val="0F172A"/>
           </w:rPr>
-          <w:t>1</w:t>
+          <w:t>21</w:t>
         </w:r>
         <w:r>
           <w:rPr>
@@ -1719,7 +1719,7 @@
             <w:b/>
             <w:color w:val="0F172A"/>
           </w:rPr>
-          <w:t>10. Updates Since Deliverable 3 (September 2026)</w:t>
+          <w:t>10. Updates Since Deliverable 3 (October 2026)</w:t>
           <w:tab/>
           <w:fldChar w:fldCharType="begin"/>
           <w:instrText xml:space="preserve"> PAGEREF _Toc0000050 \h </w:instrText>
@@ -1731,7 +1731,7 @@
             <w:noProof/>
             <w:color w:val="0F172A"/>
           </w:rPr>
-          <w:t>1</w:t>
+          <w:t>23</w:t>
         </w:r>
         <w:r>
           <w:rPr>
@@ -1757,7 +1757,7 @@
             <w:sz w:val="19"/>
             <w:szCs w:val="19"/>
           </w:rPr>
-          <w:t>10.1  Summary of Changes</w:t>
+          <w:t>10.1 Summary of Changes</w:t>
           <w:tab/>
           <w:fldChar w:fldCharType="begin"/>
           <w:instrText xml:space="preserve"> PAGEREF _Toc0000051 \h </w:instrText>
@@ -1770,7 +1770,7 @@
             <w:sz w:val="19"/>
             <w:szCs w:val="19"/>
           </w:rPr>
-          <w:t>1</w:t>
+          <w:t>23</w:t>
         </w:r>
         <w:r>
           <w:rPr>
@@ -1797,7 +1797,7 @@
             <w:sz w:val="19"/>
             <w:szCs w:val="19"/>
           </w:rPr>
-          <w:t>10.2  Current Figures</w:t>
+          <w:t>10.2 Current Figures</w:t>
           <w:tab/>
           <w:fldChar w:fldCharType="begin"/>
           <w:instrText xml:space="preserve"> PAGEREF _Toc0000052 \h </w:instrText>
@@ -1810,7 +1810,7 @@
             <w:sz w:val="19"/>
             <w:szCs w:val="19"/>
           </w:rPr>
-          <w:t>1</w:t>
+          <w:t>24</w:t>
         </w:r>
         <w:r>
           <w:rPr>
@@ -1837,7 +1837,7 @@
             <w:sz w:val="19"/>
             <w:szCs w:val="19"/>
           </w:rPr>
-          <w:t>10.3  Language Support and the SRS</w:t>
+          <w:t>10.3 Language Support and the SRS</w:t>
           <w:tab/>
           <w:fldChar w:fldCharType="begin"/>
           <w:instrText xml:space="preserve"> PAGEREF _Toc0000053 \h </w:instrText>
@@ -1850,7 +1850,7 @@
             <w:sz w:val="19"/>
             <w:szCs w:val="19"/>
           </w:rPr>
-          <w:t>1</w:t>
+          <w:t>24</w:t>
         </w:r>
         <w:r>
           <w:rPr>
@@ -1877,7 +1877,7 @@
             <w:sz w:val="19"/>
             <w:szCs w:val="19"/>
           </w:rPr>
-          <w:t>10.4  The Current Interface</w:t>
+          <w:t>10.4 The Current Interface</w:t>
           <w:tab/>
           <w:fldChar w:fldCharType="begin"/>
           <w:instrText xml:space="preserve"> PAGEREF _Toc0000054 \h </w:instrText>
@@ -1890,7 +1890,7 @@
             <w:sz w:val="19"/>
             <w:szCs w:val="19"/>
           </w:rPr>
-          <w:t>1</w:t>
+          <w:t>25</w:t>
         </w:r>
         <w:r>
           <w:rPr>
@@ -1917,7 +1917,7 @@
             <w:sz w:val="19"/>
             <w:szCs w:val="19"/>
           </w:rPr>
-          <w:t>10.5  Updated Demo Accounts and Data</w:t>
+          <w:t>10.5 Updated Demo Accounts and Data</w:t>
           <w:tab/>
           <w:fldChar w:fldCharType="begin"/>
           <w:instrText xml:space="preserve"> PAGEREF _Toc0000055 \h </w:instrText>
@@ -1930,7 +1930,7 @@
             <w:sz w:val="19"/>
             <w:szCs w:val="19"/>
           </w:rPr>
-          <w:t>1</w:t>
+          <w:t>27</w:t>
         </w:r>
         <w:r>
           <w:rPr>
@@ -1967,7 +1967,7 @@
             <w:noProof/>
             <w:color w:val="0F172A"/>
           </w:rPr>
-          <w:t>1</w:t>
+          <w:t>27</w:t>
         </w:r>
         <w:r>
           <w:rPr>
@@ -2006,7 +2006,7 @@
             <w:sz w:val="19"/>
             <w:szCs w:val="19"/>
           </w:rPr>
-          <w:t>1</w:t>
+          <w:t>27</w:t>
         </w:r>
         <w:r>
           <w:rPr>
@@ -2046,7 +2046,7 @@
             <w:sz w:val="19"/>
             <w:szCs w:val="19"/>
           </w:rPr>
-          <w:t>1</w:t>
+          <w:t>27</w:t>
         </w:r>
         <w:r>
           <w:rPr>
@@ -2086,7 +2086,7 @@
             <w:sz w:val="19"/>
             <w:szCs w:val="19"/>
           </w:rPr>
-          <w:t>1</w:t>
+          <w:t>28</w:t>
         </w:r>
         <w:r>
           <w:rPr>
@@ -2126,7 +2126,7 @@
             <w:sz w:val="19"/>
             <w:szCs w:val="19"/>
           </w:rPr>
-          <w:t>1</w:t>
+          <w:t>28</w:t>
         </w:r>
         <w:r>
           <w:rPr>
@@ -2166,7 +2166,7 @@
           <w:i/>
           <w:color w:val="1E293B"/>
         </w:rPr>
-        <w:t>Note: this document records RentalPro at Deliverable 3. Section 10 summarises what has changed since — including the current figures (18 tables, 298 tests, 85% coverage), the redesigned interface, English, Shona and Arabic interface languages chosen from a language menu (with a right-to-left layout for Arabic) and the Harare demonstration data. Since then, Arabic has been extended to every screen, message, email, SMS and PDF, every amount shows its currency, and the system has been hardened for production with security headers, a required secret key, Alembic database migrations and optional S3 file storage (see the Deliverable 6 final report, Section 3.6).</w:t>
+        <w:t>Note: this document records RentalPro as submitted for Deliverable 3, and every figure in it (93 tests, 77% coverage, 31 templates) is that of the system at the time. Section 10 summarises everything added since — the eleven gaps closed in Deliverable 5, the billing engine, the redesigned Harare interface, English, Shona and Arabic, and production hardening — with today's figures (18 tables, 298 tests, 85% coverage).</w:t>
       </w:r>
     </w:p>
     <w:p>
@@ -2193,7 +2193,7 @@
         <w:rPr>
           <w:color w:val="1E293B"/>
         </w:rPr>
-        <w:t>The deliverable satisfies the Capstone Part 1 requirement of approximately 50% product features fully implemented and tested. In practice, 100% of the planned use cases have been implemented in the backend, with a complete frontend (35 HTML templates), a real automated test suite (124 tests, 79% code coverage), and a containerised deployment configuration ready for production. Deliverable 5 (below) subsequently closed the remaining functional-requirement gaps against the SRS that this deliverable had not yet covered: unit editing, property/unit/maintenance photo uploads, tenant blacklisting, admin user and role management, staff self-service account creation, configurable late fees, and CSV/Excel export — none of which change the 13-table schema.</w:t>
+        <w:t>The deliverable satisfies the Capstone Part 1 requirement of approximately 50% product features fully implemented and tested. In practice, 100% of the planned use cases have been implemented in the backend, with a complete frontend (31 HTML templates), a real automated test suite (93 tests, 77% code coverage), and a containerised deployment configuration ready for production.</w:t>
       </w:r>
     </w:p>
     <w:p>
@@ -2353,7 +2353,7 @@
                 <w:sz w:val="36"/>
                 <w:szCs w:val="36"/>
               </w:rPr>
-              <w:t>124</w:t>
+              <w:t>93</w:t>
             </w:r>
           </w:p>
           <w:p>
@@ -2401,7 +2401,7 @@
                 <w:sz w:val="36"/>
                 <w:szCs w:val="36"/>
               </w:rPr>
-              <w:t>79%</w:t>
+              <w:t>77%</w:t>
             </w:r>
           </w:p>
           <w:p>
@@ -3996,7 +3996,7 @@
                 <w:sz w:val="18"/>
                 <w:szCs w:val="18"/>
               </w:rPr>
-              <w:t>pytest + pytest-cov — 124 tests, 79% coverage, 0 failures</w:t>
+              <w:t>pytest + pytest-cov — 93 tests, 77% coverage, 0 failures</w:t>
             </w:r>
           </w:p>
         </w:tc>
@@ -4203,7 +4203,7 @@
                 <w:sz w:val="19"/>
                 <w:szCs w:val="19"/>
               </w:rPr>
-              <w:t>• backend/                     — Flask app factory: __init__.py, config.py, models.py (13 tables), security.py, scheduler_jobs.py, routes/ (10 blueprints incl. admin.py), services/ (incl. excel.py, storage.py) — ~3,025 lines total</w:t>
+              <w:t>• backend/                     — Flask app factory: __init__.py, config.py, models.py (13 tables), security.py, scheduler_jobs.py, routes/ (9 blueprints), services/ (~2,500 lines total)</w:t>
             </w:r>
           </w:p>
         </w:tc>
@@ -4233,7 +4233,7 @@
                 <w:sz w:val="19"/>
                 <w:szCs w:val="19"/>
               </w:rPr>
-              <w:t>• frontend/templates/*.html    — 35 Jinja2 HTML templates</w:t>
+              <w:t>• frontend/templates/*.html    — 31 Jinja2 HTML templates</w:t>
             </w:r>
           </w:p>
         </w:tc>
@@ -4414,36 +4414,6 @@
                 <w:szCs w:val="19"/>
               </w:rPr>
               <w:t>• tests/test_validation.py     — 36 validation, file upload, Stripe webhook tests</w:t>
-            </w:r>
-          </w:p>
-        </w:tc>
-      </w:tr>
-      <w:tr>
-        <w:tc>
-          <w:tcPr>
-            <w:tcW w:w="9360" w:type="dxa"/>
-            <w:tcBorders>
-              <w:top w:val="none" w:sz="0" w:space="0" w:color="FFFFFF"/>
-              <w:left w:val="none" w:sz="0" w:space="0" w:color="FFFFFF"/>
-              <w:bottom w:val="none" w:sz="0" w:space="0" w:color="FFFFFF"/>
-              <w:right w:val="none" w:sz="0" w:space="0" w:color="FFFFFF"/>
-            </w:tcBorders>
-            <w:shd w:val="clear" w:color="auto" w:fill="EFF6FF"/>
-            <w:tcMar>
-              <w:top w:w="80" w:type="dxa"/>
-              <w:left w:w="210" w:type="dxa"/>
-              <w:bottom w:w="80" w:type="dxa"/>
-              <w:right w:w="210" w:type="dxa"/>
-            </w:tcMar>
-          </w:tcPr>
-          <w:p>
-            <w:r>
-              <w:rPr>
-                <w:color w:val="1E293B"/>
-                <w:sz w:val="19"/>
-                <w:szCs w:val="19"/>
-              </w:rPr>
-              <w:t>• tests/test_deliverable5.py    — 31 Deliverable 5 feature-completion tests</w:t>
             </w:r>
           </w:p>
         </w:tc>
@@ -10106,7 +10076,7 @@
       <w:bookmarkStart w:id="6" w:name="_Toc0000007"/>
       <w:r>
         <w:lastRenderedPageBreak/>
-        <w:t>4. Frontend — 35 Jinja2 HTML Templates</w:t>
+        <w:t>4. Frontend — 31 Jinja2 HTML Templates</w:t>
       </w:r>
       <w:bookmarkEnd w:id="6"/>
     </w:p>
@@ -10118,7 +10088,7 @@
         <w:rPr>
           <w:color w:val="1E293B"/>
         </w:rPr>
-        <w:t>Every route has a matching HTML template. All 35 templates parse cleanly under Jinja2 and were verified to render 200 OK during server testing. The UI uses a consistent design system with role-based sidebar navigation, responsive layout, and flash message handling.</w:t>
+        <w:t>Every route has a matching HTML template. All 31 templates parse cleanly under Jinja2 and were verified to render 200 OK during server testing. The UI uses a consistent design system with role-based sidebar navigation, responsive layout, and flash message handling.</w:t>
       </w:r>
     </w:p>
     <w:p>
@@ -12584,7 +12554,7 @@
       <w:bookmarkStart w:id="7" w:name="_Toc0000008"/>
       <w:r>
         <w:lastRenderedPageBreak/>
-        <w:t>5. Automated Test Suite — 124 Tests, 79% Coverage</w:t>
+        <w:t>5. Automated Test Suite — 93 Tests, 77% Coverage</w:t>
       </w:r>
       <w:bookmarkEnd w:id="7"/>
     </w:p>
@@ -12709,7 +12679,7 @@
                 <w:sz w:val="36"/>
                 <w:szCs w:val="36"/>
               </w:rPr>
-              <w:t>124</w:t>
+              <w:t>93</w:t>
             </w:r>
           </w:p>
           <w:p>
@@ -12853,7 +12823,7 @@
                 <w:sz w:val="36"/>
                 <w:szCs w:val="36"/>
               </w:rPr>
-              <w:t>79%</w:t>
+              <w:t>77%</w:t>
             </w:r>
           </w:p>
           <w:p>
@@ -14842,7 +14812,7 @@
                 <w:sz w:val="19"/>
                 <w:szCs w:val="19"/>
               </w:rPr>
-              <w:t>• pytest tests/ -v                                    # run all 124 tests</w:t>
+              <w:t>• pytest tests/ -v                                    # run all 93 tests</w:t>
             </w:r>
           </w:p>
         </w:tc>
@@ -16260,7 +16230,7 @@
                 <w:sz w:val="18"/>
                 <w:szCs w:val="18"/>
               </w:rPr>
-              <w:t>admin@rentalpro.com / owner@rentalpro.com / manager@rentalpro.com / tenant1@email.com / staff@rentalpro.com — all password: demo123</w:t>
+              <w:t>owner@rentalpro.com / manager@rentalpro.com / tenant1@email.com / staff@rentalpro.com — all password: demo123</w:t>
             </w:r>
           </w:p>
         </w:tc>
@@ -21518,7 +21488,7 @@
                 <w:sz w:val="17"/>
                 <w:szCs w:val="17"/>
               </w:rPr>
-              <w:t>124 tests pass</w:t>
+              <w:t>93 tests pass</w:t>
             </w:r>
           </w:p>
         </w:tc>
@@ -21547,7 +21517,7 @@
                 <w:sz w:val="18"/>
                 <w:szCs w:val="18"/>
               </w:rPr>
-              <w:t>pytest tests/ -v → 124 passed, 0 failed</w:t>
+              <w:t>pytest tests/ -v → 93 passed, 0 failed</w:t>
             </w:r>
           </w:p>
         </w:tc>
@@ -21612,7 +21582,7 @@
                 <w:sz w:val="17"/>
                 <w:szCs w:val="17"/>
               </w:rPr>
-              <w:t>79%</w:t>
+              <w:t>77%</w:t>
             </w:r>
           </w:p>
         </w:tc>
@@ -21641,7 +21611,7 @@
                 <w:sz w:val="18"/>
                 <w:szCs w:val="18"/>
               </w:rPr>
-              <w:t>pytest --cov=backend → 79% statement coverage</w:t>
+              <w:t>pytest --cov=backend → 77% statement coverage</w:t>
             </w:r>
           </w:p>
         </w:tc>
@@ -22227,7 +22197,7 @@
                 <w:sz w:val="19"/>
                 <w:szCs w:val="19"/>
               </w:rPr>
-              <w:t>• The automated test suite (124 tests, 79% coverage, 0 failures) provides repeatable proof that every feature works correctly.</w:t>
+              <w:t>• The automated test suite (93 tests, 77% coverage, 0 failures) provides repeatable proof that every feature works correctly.</w:t>
             </w:r>
           </w:p>
         </w:tc>
@@ -22323,6 +22293,11 @@
         </w:tc>
       </w:tr>
     </w:tbl>
+    <w:p>
+      <w:r>
+        <w:br w:type="page"/>
+      </w:r>
+    </w:p>
     <w:p>
       <w:r>
         <w:br w:type="page"/>
@@ -22337,7 +22312,7 @@
       </w:pPr>
       <w:bookmarkStart w:id="950" w:name="_Toc0000050"/>
       <w:r>
-        <w:t xml:space="preserve">10. Updates Since Deliverable 3 (September 2026)</w:t>
+        <w:t>10. Updates Since Deliverable 3 (October 2026)</w:t>
       </w:r>
       <w:bookmarkEnd w:id="950"/>
     </w:p>
@@ -22349,7 +22324,7 @@
         <w:rPr>
           <w:color w:val="1E293B"/>
         </w:rPr>
-        <w:t xml:space="preserve">This section brings the document up to date. The rest of the document describes RentalPro as it stood at Deliverable 3, and its figures are deliberately left as they were at that time. Since then the system has gained a billing engine, a property map, a redesigned interface, English, Shona and Arabic interface languages, Harare demonstration data, a tenant history page for each unit and a maintenance summary report. Each change was made additively, behind the existing test suite, with new tests of its own.</w:t>
+        <w:t>This section brings the document up to date. The rest of the document describes RentalPro as submitted for Deliverable 3, and its figures are deliberately left as they were at that time. Since then, Deliverable 5 closed eleven gaps against the SRS, and the system has gained a billing engine, a property map, a redesigned interface, English, Shona and Arabic interface languages, Harare demonstration data, a tenant history page for each unit and a maintenance summary report, and finally full Arabic and production hardening. Each change was made additively, behind the existing test suite, with new tests of its own.</w:t>
       </w:r>
     </w:p>
     <w:p>
@@ -22508,6 +22483,95 @@
                 <w:sz w:val="18"/>
                 <w:szCs w:val="18"/>
               </w:rPr>
+              <w:t>Deliverable 5</w:t>
+            </w:r>
+          </w:p>
+        </w:tc>
+        <w:tc>
+          <w:tcPr>
+            <w:tcW w:w="6260" w:type="dxa"/>
+            <w:tcBorders>
+              <w:top w:val="single" w:sz="4" w:space="0" w:color="E2E8F0"/>
+              <w:left w:val="nil"/>
+              <w:bottom w:val="single" w:sz="4" w:space="0" w:color="E2E8F0"/>
+              <w:right w:val="nil"/>
+            </w:tcBorders>
+            <w:shd w:val="clear" w:color="auto" w:fill="FFFFFF"/>
+            <w:tcMar>
+              <w:top w:w="90" w:type="dxa"/>
+              <w:left w:w="160" w:type="dxa"/>
+              <w:bottom w:w="90" w:type="dxa"/>
+              <w:right w:w="160" w:type="dxa"/>
+            </w:tcMar>
+            <w:vAlign w:val="center"/>
+          </w:tcPr>
+          <w:p>
+            <w:r>
+              <w:rPr>
+                <w:color w:val="1E293B"/>
+                <w:sz w:val="18"/>
+                <w:szCs w:val="18"/>
+              </w:rPr>
+              <w:t>Eleven gaps against the SRS closed: editing units; property, unit and maintenance photos; tenant ID documents; lease document download; tenant blacklisting; administrator user and role management; staff account creation; configurable late fees; CSV and Excel exports.</w:t>
+            </w:r>
+          </w:p>
+        </w:tc>
+        <w:tc>
+          <w:tcPr>
+            <w:tcW w:w="1200" w:type="dxa"/>
+            <w:tcBorders>
+              <w:top w:val="single" w:sz="4" w:space="0" w:color="E2E8F0"/>
+              <w:left w:val="nil"/>
+              <w:bottom w:val="single" w:sz="4" w:space="0" w:color="E2E8F0"/>
+              <w:right w:val="nil"/>
+            </w:tcBorders>
+            <w:shd w:val="clear" w:color="auto" w:fill="FFFFFF"/>
+            <w:tcMar>
+              <w:top w:w="90" w:type="dxa"/>
+              <w:left w:w="160" w:type="dxa"/>
+              <w:bottom w:w="90" w:type="dxa"/>
+              <w:right w:w="160" w:type="dxa"/>
+            </w:tcMar>
+            <w:vAlign w:val="center"/>
+          </w:tcPr>
+          <w:p>
+            <w:r>
+              <w:rPr>
+                <w:color w:val="1E293B"/>
+                <w:sz w:val="18"/>
+                <w:szCs w:val="18"/>
+              </w:rPr>
+              <w:t>31</w:t>
+            </w:r>
+          </w:p>
+        </w:tc>
+      </w:tr>
+      <w:tr>
+        <w:tc>
+          <w:tcPr>
+            <w:tcW w:w="1900" w:type="dxa"/>
+            <w:tcBorders>
+              <w:top w:val="single" w:sz="4" w:space="0" w:color="E2E8F0"/>
+              <w:left w:val="nil"/>
+              <w:bottom w:val="single" w:sz="4" w:space="0" w:color="E2E8F0"/>
+              <w:right w:val="nil"/>
+            </w:tcBorders>
+            <w:shd w:val="clear" w:color="auto" w:fill="FFFFFF"/>
+            <w:tcMar>
+              <w:top w:w="90" w:type="dxa"/>
+              <w:left w:w="160" w:type="dxa"/>
+              <w:bottom w:w="90" w:type="dxa"/>
+              <w:right w:w="160" w:type="dxa"/>
+            </w:tcMar>
+            <w:vAlign w:val="center"/>
+          </w:tcPr>
+          <w:p>
+            <w:r>
+              <w:rPr>
+                <w:color w:val="1E293B"/>
+                <w:sz w:val="18"/>
+                <w:szCs w:val="18"/>
+              </w:rPr>
               <w:t xml:space="preserve">Billing engine</w:t>
             </w:r>
           </w:p>
@@ -23190,6 +23254,95 @@
                 <w:szCs w:val="18"/>
               </w:rPr>
               <w:t xml:space="preserve">13</w:t>
+            </w:r>
+          </w:p>
+        </w:tc>
+      </w:tr>
+      <w:tr>
+        <w:tc>
+          <w:tcPr>
+            <w:tcW w:w="1900" w:type="dxa"/>
+            <w:tcBorders>
+              <w:top w:val="single" w:sz="4" w:space="0" w:color="E2E8F0"/>
+              <w:left w:val="nil"/>
+              <w:bottom w:val="single" w:sz="4" w:space="0" w:color="E2E8F0"/>
+              <w:right w:val="nil"/>
+            </w:tcBorders>
+            <w:shd w:val="clear" w:color="auto" w:fill="FFFFFF"/>
+            <w:tcMar>
+              <w:top w:w="90" w:type="dxa"/>
+              <w:left w:w="160" w:type="dxa"/>
+              <w:bottom w:w="90" w:type="dxa"/>
+              <w:right w:w="160" w:type="dxa"/>
+            </w:tcMar>
+            <w:vAlign w:val="center"/>
+          </w:tcPr>
+          <w:p>
+            <w:r>
+              <w:rPr>
+                <w:color w:val="1E293B"/>
+                <w:sz w:val="18"/>
+                <w:szCs w:val="18"/>
+              </w:rPr>
+              <w:t>Full Arabic &amp; hardening</w:t>
+            </w:r>
+          </w:p>
+        </w:tc>
+        <w:tc>
+          <w:tcPr>
+            <w:tcW w:w="6260" w:type="dxa"/>
+            <w:tcBorders>
+              <w:top w:val="single" w:sz="4" w:space="0" w:color="E2E8F0"/>
+              <w:left w:val="nil"/>
+              <w:bottom w:val="single" w:sz="4" w:space="0" w:color="E2E8F0"/>
+              <w:right w:val="nil"/>
+            </w:tcBorders>
+            <w:shd w:val="clear" w:color="auto" w:fill="FFFFFF"/>
+            <w:tcMar>
+              <w:top w:w="90" w:type="dxa"/>
+              <w:left w:w="160" w:type="dxa"/>
+              <w:bottom w:w="90" w:type="dxa"/>
+              <w:right w:w="160" w:type="dxa"/>
+            </w:tcMar>
+            <w:vAlign w:val="center"/>
+          </w:tcPr>
+          <w:p>
+            <w:r>
+              <w:rPr>
+                <w:color w:val="1E293B"/>
+                <w:sz w:val="18"/>
+                <w:szCs w:val="18"/>
+              </w:rPr>
+              <w:t>Arabic on every page, message, email, SMS and PDF; each user's language saved; every amount with its currency; security headers and a required secret key; Alembic database migrations; optional S3-compatible file storage.</w:t>
+            </w:r>
+          </w:p>
+        </w:tc>
+        <w:tc>
+          <w:tcPr>
+            <w:tcW w:w="1200" w:type="dxa"/>
+            <w:tcBorders>
+              <w:top w:val="single" w:sz="4" w:space="0" w:color="E2E8F0"/>
+              <w:left w:val="nil"/>
+              <w:bottom w:val="single" w:sz="4" w:space="0" w:color="E2E8F0"/>
+              <w:right w:val="nil"/>
+            </w:tcBorders>
+            <w:shd w:val="clear" w:color="auto" w:fill="FFFFFF"/>
+            <w:tcMar>
+              <w:top w:w="90" w:type="dxa"/>
+              <w:left w:w="160" w:type="dxa"/>
+              <w:bottom w:w="90" w:type="dxa"/>
+              <w:right w:w="160" w:type="dxa"/>
+            </w:tcMar>
+            <w:vAlign w:val="center"/>
+          </w:tcPr>
+          <w:p>
+            <w:r>
+              <w:rPr>
+                <w:color w:val="1E293B"/>
+                <w:sz w:val="18"/>
+                <w:szCs w:val="18"/>
+              </w:rPr>
+              <w:t>54</w:t>
             </w:r>
           </w:p>
         </w:tc>
@@ -23385,7 +23538,7 @@
                 <w:sz w:val="18"/>
                 <w:szCs w:val="18"/>
               </w:rPr>
-              <w:t xml:space="preserve">13</w:t>
+              <w:t>13</w:t>
             </w:r>
           </w:p>
         </w:tc>
@@ -23474,7 +23627,7 @@
                 <w:sz w:val="18"/>
                 <w:szCs w:val="18"/>
               </w:rPr>
-              <w:t xml:space="preserve">35</w:t>
+              <w:t>31</w:t>
             </w:r>
           </w:p>
         </w:tc>
@@ -23563,7 +23716,7 @@
                 <w:sz w:val="18"/>
                 <w:szCs w:val="18"/>
               </w:rPr>
-              <w:t xml:space="preserve">4</w:t>
+              <w:t>4</w:t>
             </w:r>
           </w:p>
         </w:tc>
@@ -23652,7 +23805,7 @@
                 <w:sz w:val="18"/>
                 <w:szCs w:val="18"/>
               </w:rPr>
-              <w:t xml:space="preserve">124</w:t>
+              <w:t>93</w:t>
             </w:r>
           </w:p>
         </w:tc>
@@ -23741,7 +23894,7 @@
                 <w:sz w:val="18"/>
                 <w:szCs w:val="18"/>
               </w:rPr>
-              <w:t xml:space="preserve">79%</w:t>
+              <w:t>77%</w:t>
             </w:r>
           </w:p>
         </w:tc>
@@ -23923,7 +24076,7 @@
         <w:rPr>
           <w:color w:val="1E293B"/>
         </w:rPr>
-        <w:t xml:space="preserve">Templates wrap interface text in _("…"); backend/i18n.py looks each phrase up in the table for the chosen language (the Shona and Arabic tables hold the same 98 phrases) and falls back to English for anything not yet translated, so the app works at every stage of translation.</w:t>
+        <w:t xml:space="preserve"> Templates wrap interface text in _("…"); backend/i18n.py looks each phrase up in the table for the chosen language — the Arabic table covers all 613 phrases the app shows or sends, the Shona table the 98 on the main screens — and falls back to English for anything not yet translated, so the app works at every stage of translation.</w:t>
       </w:r>
     </w:p>
     <w:p>
@@ -23969,7 +24122,7 @@
         <w:rPr>
           <w:color w:val="1E293B"/>
         </w:rPr>
-        <w:t xml:space="preserve">A language button in the top bar and on the login page shows the current language; clicking its arrow opens a vertical list of English, ChiShona and Arabic, each written in its own language. The list closes on a click elsewhere or the Escape key. The choice is stored in the session and survives logging in and out, and the menu’s return address is checked so it cannot redirect off-site.</w:t>
+        <w:t xml:space="preserve"> A language button in the top bar and on the login page shows the current language; clicking its arrow opens a vertical list of English, ChiShona and Arabic, each written in its own language. The list closes on a click elsewhere or the Escape key. The choice survives logging in and out and is saved to the user's account, so it follows them to any browser and their emails and SMS are written in it; the menu’s return address is checked so it cannot redirect off-site.</w:t>
       </w:r>
     </w:p>
     <w:p>
@@ -23986,13 +24139,13 @@
           <w:bCs/>
           <w:color w:val="1E293B"/>
         </w:rPr>
-        <w:t xml:space="preserve">Translated so far: </w:t>
+        <w:t xml:space="preserve">Translated: </w:t>
       </w:r>
       <w:r>
         <w:rPr>
           <w:color w:val="1E293B"/>
         </w:rPr>
-        <w:t xml:space="preserve">Navigation for every role, login and password reset, the dashboards, the properties, tenants, rent tracker and maintenance lists, the tenant portal and status badges. Other pages and on-screen messages are still English only.</w:t>
+        <w:t>Arabic covers every page, form option and message, every email and SMS, the PDFs (with joined, right-to-left letters) and the Excel and CSV exports; a test fails if any text the app shows or sends has no Arabic. Shona covers navigation for every role, login and password reset, the dashboards, the main list pages, the tenant portal and status badges; other Shona text falls back to English.</w:t>
       </w:r>
     </w:p>
     <w:p>
@@ -24038,7 +24191,7 @@
         <w:rPr>
           <w:color w:val="1E293B"/>
         </w:rPr>
-        <w:t xml:space="preserve">Fourteen tests cover the languages: switching to Shona and to Arabic, the right-to-left direction for Arabic only, the choice surviving login, the tenant portal in Shona and in Arabic, the language menu, unknown language codes, off-site redirects, placeholders kept in every translation, Arabic covering every Shona phrase, and place names.</w:t>
+        <w:t>Fourteen tests cover the languages: switching to Shona and to Arabic, the right-to-left direction for Arabic only, the choice surviving login, the tenant portal in Shona and in Arabic, the language menu, unknown language codes, off-site redirects, placeholders kept in every translation, Arabic covering every Shona phrase, and place names. Later tests check that every phrase the app shows or sends has Arabic, and that emails, SMS, PDFs, Excel and CSV follow the reader's language.</w:t>
       </w:r>
     </w:p>
     <w:p>
@@ -24100,7 +24253,7 @@
                     </pic:cNvPicPr>
                   </pic:nvPicPr>
                   <pic:blipFill>
-                    <a:blip r:embed="rId900"/>
+                    <a:blip r:embed="rId12"/>
                     <a:stretch>
                       <a:fillRect/>
                     </a:stretch>
@@ -24166,7 +24319,7 @@
                     </pic:cNvPicPr>
                   </pic:nvPicPr>
                   <pic:blipFill>
-                    <a:blip r:embed="rId901"/>
+                    <a:blip r:embed="rId13"/>
                     <a:stretch>
                       <a:fillRect/>
                     </a:stretch>
@@ -24232,7 +24385,7 @@
                     </pic:cNvPicPr>
                   </pic:nvPicPr>
                   <pic:blipFill>
-                    <a:blip r:embed="rId902"/>
+                    <a:blip r:embed="rId14"/>
                     <a:stretch>
                       <a:fillRect/>
                     </a:stretch>
@@ -25543,7 +25696,7 @@
                 <w:sz w:val="19"/>
                 <w:szCs w:val="19"/>
               </w:rPr>
-              <w:t>• pytest tests/ -v                                  # all 124 tests</w:t>
+              <w:t>• pytest tests/ -v                                  # all 93 tests</w:t>
             </w:r>
           </w:p>
         </w:tc>
@@ -25573,7 +25726,7 @@
                 <w:sz w:val="19"/>
                 <w:szCs w:val="19"/>
               </w:rPr>
-              <w:t>• pytest tests/ --cov=backend --cov-report=term-missing # with 79% coverage</w:t>
+              <w:t>• pytest tests/ --cov=backend --cov-report=term-missing # with 77% coverage</w:t>
             </w:r>
           </w:p>
         </w:tc>
@@ -25936,130 +26089,6 @@
                 <w:szCs w:val="18"/>
               </w:rPr>
               <w:t>demo123 — TENANT — portal only</w:t>
-            </w:r>
-          </w:p>
-        </w:tc>
-      </w:tr>
-      <w:tr>
-        <w:tc>
-          <w:tcPr>
-            <w:tcW w:w="2880" w:type="dxa"/>
-            <w:tcBorders>
-              <w:top w:val="single" w:sz="4" w:space="0" w:color="E2E8F0"/>
-              <w:left w:val="nil"/>
-              <w:bottom w:val="single" w:sz="4" w:space="0" w:color="E2E8F0"/>
-              <w:right w:val="nil"/>
-            </w:tcBorders>
-            <w:shd w:val="clear" w:color="auto" w:fill="EFF6FF"/>
-            <w:tcMar>
-              <w:top w:w="90" w:type="dxa"/>
-              <w:left w:w="160" w:type="dxa"/>
-              <w:bottom w:w="90" w:type="dxa"/>
-              <w:right w:w="160" w:type="dxa"/>
-            </w:tcMar>
-            <w:vAlign w:val="center"/>
-          </w:tcPr>
-          <w:p>
-            <w:r>
-              <w:rPr>
-                <w:b/>
-                <w:bCs/>
-                <w:color w:val="0F172A"/>
-                <w:sz w:val="18"/>
-                <w:szCs w:val="18"/>
-              </w:rPr>
-              <w:t>tenant2@email.com … tenant9@email.com</w:t>
-            </w:r>
-          </w:p>
-        </w:tc>
-        <w:tc>
-          <w:tcPr>
-            <w:tcW w:w="6480" w:type="dxa"/>
-            <w:tcBorders>
-              <w:top w:val="single" w:sz="4" w:space="0" w:color="E2E8F0"/>
-              <w:left w:val="nil"/>
-              <w:bottom w:val="single" w:sz="4" w:space="0" w:color="E2E8F0"/>
-              <w:right w:val="nil"/>
-            </w:tcBorders>
-            <w:shd w:val="clear" w:color="auto" w:fill="FFFFFF"/>
-            <w:tcMar>
-              <w:top w:w="90" w:type="dxa"/>
-              <w:left w:w="160" w:type="dxa"/>
-              <w:bottom w:w="90" w:type="dxa"/>
-              <w:right w:w="160" w:type="dxa"/>
-            </w:tcMar>
-            <w:vAlign w:val="center"/>
-          </w:tcPr>
-          <w:p>
-            <w:r>
-              <w:rPr>
-                <w:color w:val="1E293B"/>
-                <w:sz w:val="18"/>
-                <w:szCs w:val="18"/>
-              </w:rPr>
-              <w:t>demo123 — TENANT — eight further Harare tenants (Section 10)</w:t>
-            </w:r>
-          </w:p>
-        </w:tc>
-      </w:tr>
-      <w:tr>
-        <w:tc>
-          <w:tcPr>
-            <w:tcW w:w="2880" w:type="dxa"/>
-            <w:tcBorders>
-              <w:top w:val="single" w:sz="4" w:space="0" w:color="E2E8F0"/>
-              <w:left w:val="nil"/>
-              <w:bottom w:val="single" w:sz="4" w:space="0" w:color="E2E8F0"/>
-              <w:right w:val="nil"/>
-            </w:tcBorders>
-            <w:shd w:val="clear" w:color="auto" w:fill="F0F9FF"/>
-            <w:tcMar>
-              <w:top w:w="90" w:type="dxa"/>
-              <w:left w:w="160" w:type="dxa"/>
-              <w:bottom w:w="90" w:type="dxa"/>
-              <w:right w:w="160" w:type="dxa"/>
-            </w:tcMar>
-            <w:vAlign w:val="center"/>
-          </w:tcPr>
-          <w:p>
-            <w:r>
-              <w:rPr>
-                <w:b/>
-                <w:bCs/>
-                <w:color w:val="0F172A"/>
-                <w:sz w:val="18"/>
-                <w:szCs w:val="18"/>
-              </w:rPr>
-              <w:t>admin@rentalpro.com</w:t>
-            </w:r>
-          </w:p>
-        </w:tc>
-        <w:tc>
-          <w:tcPr>
-            <w:tcW w:w="6480" w:type="dxa"/>
-            <w:tcBorders>
-              <w:top w:val="single" w:sz="4" w:space="0" w:color="E2E8F0"/>
-              <w:left w:val="nil"/>
-              <w:bottom w:val="single" w:sz="4" w:space="0" w:color="E2E8F0"/>
-              <w:right w:val="nil"/>
-            </w:tcBorders>
-            <w:shd w:val="clear" w:color="auto" w:fill="F8FAFC"/>
-            <w:tcMar>
-              <w:top w:w="90" w:type="dxa"/>
-              <w:left w:w="160" w:type="dxa"/>
-              <w:bottom w:w="90" w:type="dxa"/>
-              <w:right w:w="160" w:type="dxa"/>
-            </w:tcMar>
-            <w:vAlign w:val="center"/>
-          </w:tcPr>
-          <w:p>
-            <w:r>
-              <w:rPr>
-                <w:color w:val="1E293B"/>
-                <w:sz w:val="18"/>
-                <w:szCs w:val="18"/>
-              </w:rPr>
-              <w:t>demo123 — ADMIN — user &amp; role management, bypasses ownership checks</w:t>
             </w:r>
           </w:p>
         </w:tc>

</xml_diff>

<commit_message>
Keep D3 exactly as submitted and make D4, D5 and D6 agree with it
D3 is restored byte-for-byte to the version submitted (48bac48), with no
added note or section. D5 and D6 no longer say D3 was corrected or has an
'updates since' section; they describe it as standing as submitted (93
tests, 77% coverage), which D4's body already matches. The README's file
guide now counts the 5 background jobs.

Co-Authored-By: Claude Opus 5.5 <noreply@anthropic.com>
Claude-Session: https://claude.ai/code/session_01Ae7GFufZcC1fFQLcjKeCLN
</commit_message>
<xml_diff>
--- a/docs/ABDURRAHMAAN_IT401_DEL_3.docx
+++ b/docs/ABDURRAHMAAN_IT401_DEL_3.docx
@@ -887,7 +887,7 @@
             <w:noProof/>
             <w:color w:val="0F172A"/>
           </w:rPr>
-          <w:t>4</w:t>
+          <w:t>1</w:t>
         </w:r>
         <w:r>
           <w:rPr>
@@ -923,7 +923,7 @@
             <w:noProof/>
             <w:color w:val="0F172A"/>
           </w:rPr>
-          <w:t>5</w:t>
+          <w:t>1</w:t>
         </w:r>
         <w:r>
           <w:rPr>
@@ -962,7 +962,7 @@
             <w:sz w:val="19"/>
             <w:szCs w:val="19"/>
           </w:rPr>
-          <w:t>5</w:t>
+          <w:t>1</w:t>
         </w:r>
         <w:r>
           <w:rPr>
@@ -1002,7 +1002,7 @@
             <w:sz w:val="19"/>
             <w:szCs w:val="19"/>
           </w:rPr>
-          <w:t>6</w:t>
+          <w:t>1</w:t>
         </w:r>
         <w:r>
           <w:rPr>
@@ -1042,7 +1042,7 @@
             <w:sz w:val="19"/>
             <w:szCs w:val="19"/>
           </w:rPr>
-          <w:t>6</w:t>
+          <w:t>1</w:t>
         </w:r>
         <w:r>
           <w:rPr>
@@ -1079,7 +1079,7 @@
             <w:noProof/>
             <w:color w:val="0F172A"/>
           </w:rPr>
-          <w:t>8</w:t>
+          <w:t>1</w:t>
         </w:r>
         <w:r>
           <w:rPr>
@@ -1115,7 +1115,7 @@
             <w:noProof/>
             <w:color w:val="0F172A"/>
           </w:rPr>
-          <w:t>10</w:t>
+          <w:t>1</w:t>
         </w:r>
         <w:r>
           <w:rPr>
@@ -1151,7 +1151,7 @@
             <w:noProof/>
             <w:color w:val="0F172A"/>
           </w:rPr>
-          <w:t>12</w:t>
+          <w:t>1</w:t>
         </w:r>
         <w:r>
           <w:rPr>
@@ -1190,7 +1190,7 @@
             <w:sz w:val="19"/>
             <w:szCs w:val="19"/>
           </w:rPr>
-          <w:t>12</w:t>
+          <w:t>1</w:t>
         </w:r>
         <w:r>
           <w:rPr>
@@ -1230,7 +1230,7 @@
             <w:sz w:val="19"/>
             <w:szCs w:val="19"/>
           </w:rPr>
-          <w:t>13</w:t>
+          <w:t>1</w:t>
         </w:r>
         <w:r>
           <w:rPr>
@@ -1270,7 +1270,7 @@
             <w:sz w:val="19"/>
             <w:szCs w:val="19"/>
           </w:rPr>
-          <w:t>14</w:t>
+          <w:t>1</w:t>
         </w:r>
         <w:r>
           <w:rPr>
@@ -1307,7 +1307,7 @@
             <w:noProof/>
             <w:color w:val="0F172A"/>
           </w:rPr>
-          <w:t>15</w:t>
+          <w:t>1</w:t>
         </w:r>
         <w:r>
           <w:rPr>
@@ -1343,7 +1343,7 @@
             <w:noProof/>
             <w:color w:val="0F172A"/>
           </w:rPr>
-          <w:t>16</w:t>
+          <w:t>1</w:t>
         </w:r>
         <w:r>
           <w:rPr>
@@ -1382,7 +1382,7 @@
             <w:sz w:val="19"/>
             <w:szCs w:val="19"/>
           </w:rPr>
-          <w:t>16</w:t>
+          <w:t>1</w:t>
         </w:r>
         <w:r>
           <w:rPr>
@@ -1422,7 +1422,7 @@
             <w:sz w:val="19"/>
             <w:szCs w:val="19"/>
           </w:rPr>
-          <w:t>16</w:t>
+          <w:t>1</w:t>
         </w:r>
         <w:r>
           <w:rPr>
@@ -1462,7 +1462,7 @@
             <w:sz w:val="19"/>
             <w:szCs w:val="19"/>
           </w:rPr>
-          <w:t>17</w:t>
+          <w:t>1</w:t>
         </w:r>
         <w:r>
           <w:rPr>
@@ -1499,7 +1499,7 @@
             <w:noProof/>
             <w:color w:val="0F172A"/>
           </w:rPr>
-          <w:t>18</w:t>
+          <w:t>1</w:t>
         </w:r>
         <w:r>
           <w:rPr>
@@ -1538,7 +1538,7 @@
             <w:sz w:val="19"/>
             <w:szCs w:val="19"/>
           </w:rPr>
-          <w:t>18</w:t>
+          <w:t>1</w:t>
         </w:r>
         <w:r>
           <w:rPr>
@@ -1578,7 +1578,7 @@
             <w:sz w:val="19"/>
             <w:szCs w:val="19"/>
           </w:rPr>
-          <w:t>19</w:t>
+          <w:t>1</w:t>
         </w:r>
         <w:r>
           <w:rPr>
@@ -1618,7 +1618,7 @@
             <w:sz w:val="19"/>
             <w:szCs w:val="19"/>
           </w:rPr>
-          <w:t>19</w:t>
+          <w:t>1</w:t>
         </w:r>
         <w:r>
           <w:rPr>
@@ -1658,7 +1658,7 @@
             <w:sz w:val="19"/>
             <w:szCs w:val="19"/>
           </w:rPr>
-          <w:t>20</w:t>
+          <w:t>1</w:t>
         </w:r>
         <w:r>
           <w:rPr>
@@ -1695,248 +1695,12 @@
             <w:noProof/>
             <w:color w:val="0F172A"/>
           </w:rPr>
-          <w:t>21</w:t>
+          <w:t>1</w:t>
         </w:r>
         <w:r>
           <w:rPr>
             <w:b/>
             <w:color w:val="0F172A"/>
-          </w:rPr>
-          <w:fldChar w:fldCharType="end"/>
-        </w:r>
-      </w:hyperlink>
-    </w:p>
-    <w:p>
-      <w:pPr>
-        <w:tabs>
-          <w:tab w:val="right" w:leader="dot" w:pos="10080"/>
-        </w:tabs>
-        <w:spacing w:after="100"/>
-      </w:pPr>
-      <w:hyperlink w:anchor="_Toc0000050" w:history="1">
-        <w:r>
-          <w:rPr>
-            <w:b/>
-            <w:color w:val="0F172A"/>
-          </w:rPr>
-          <w:t>10. Updates Since Deliverable 3 (October 2026)</w:t>
-          <w:tab/>
-          <w:fldChar w:fldCharType="begin"/>
-          <w:instrText xml:space="preserve"> PAGEREF _Toc0000050 \h </w:instrText>
-          <w:fldChar w:fldCharType="separate"/>
-        </w:r>
-        <w:r>
-          <w:rPr>
-            <w:b/>
-            <w:noProof/>
-            <w:color w:val="0F172A"/>
-          </w:rPr>
-          <w:t>23</w:t>
-        </w:r>
-        <w:r>
-          <w:rPr>
-            <w:b/>
-            <w:color w:val="0F172A"/>
-          </w:rPr>
-          <w:fldChar w:fldCharType="end"/>
-        </w:r>
-      </w:hyperlink>
-    </w:p>
-    <w:p>
-      <w:pPr>
-        <w:tabs>
-          <w:tab w:val="right" w:leader="dot" w:pos="10080"/>
-        </w:tabs>
-        <w:spacing w:after="70"/>
-        <w:ind w:left="260"/>
-      </w:pPr>
-      <w:hyperlink w:anchor="_Toc0000051" w:history="1">
-        <w:r>
-          <w:rPr>
-            <w:color w:val="475569"/>
-            <w:sz w:val="19"/>
-            <w:szCs w:val="19"/>
-          </w:rPr>
-          <w:t>10.1 Summary of Changes</w:t>
-          <w:tab/>
-          <w:fldChar w:fldCharType="begin"/>
-          <w:instrText xml:space="preserve"> PAGEREF _Toc0000051 \h </w:instrText>
-          <w:fldChar w:fldCharType="separate"/>
-        </w:r>
-        <w:r>
-          <w:rPr>
-            <w:noProof/>
-            <w:color w:val="475569"/>
-            <w:sz w:val="19"/>
-            <w:szCs w:val="19"/>
-          </w:rPr>
-          <w:t>23</w:t>
-        </w:r>
-        <w:r>
-          <w:rPr>
-            <w:color w:val="475569"/>
-            <w:sz w:val="19"/>
-            <w:szCs w:val="19"/>
-          </w:rPr>
-          <w:fldChar w:fldCharType="end"/>
-        </w:r>
-      </w:hyperlink>
-    </w:p>
-    <w:p>
-      <w:pPr>
-        <w:tabs>
-          <w:tab w:val="right" w:leader="dot" w:pos="10080"/>
-        </w:tabs>
-        <w:spacing w:after="70"/>
-        <w:ind w:left="260"/>
-      </w:pPr>
-      <w:hyperlink w:anchor="_Toc0000052" w:history="1">
-        <w:r>
-          <w:rPr>
-            <w:color w:val="475569"/>
-            <w:sz w:val="19"/>
-            <w:szCs w:val="19"/>
-          </w:rPr>
-          <w:t>10.2 Current Figures</w:t>
-          <w:tab/>
-          <w:fldChar w:fldCharType="begin"/>
-          <w:instrText xml:space="preserve"> PAGEREF _Toc0000052 \h </w:instrText>
-          <w:fldChar w:fldCharType="separate"/>
-        </w:r>
-        <w:r>
-          <w:rPr>
-            <w:noProof/>
-            <w:color w:val="475569"/>
-            <w:sz w:val="19"/>
-            <w:szCs w:val="19"/>
-          </w:rPr>
-          <w:t>24</w:t>
-        </w:r>
-        <w:r>
-          <w:rPr>
-            <w:color w:val="475569"/>
-            <w:sz w:val="19"/>
-            <w:szCs w:val="19"/>
-          </w:rPr>
-          <w:fldChar w:fldCharType="end"/>
-        </w:r>
-      </w:hyperlink>
-    </w:p>
-    <w:p>
-      <w:pPr>
-        <w:tabs>
-          <w:tab w:val="right" w:leader="dot" w:pos="10080"/>
-        </w:tabs>
-        <w:spacing w:after="70"/>
-        <w:ind w:left="260"/>
-      </w:pPr>
-      <w:hyperlink w:anchor="_Toc0000053" w:history="1">
-        <w:r>
-          <w:rPr>
-            <w:color w:val="475569"/>
-            <w:sz w:val="19"/>
-            <w:szCs w:val="19"/>
-          </w:rPr>
-          <w:t>10.3 Language Support and the SRS</w:t>
-          <w:tab/>
-          <w:fldChar w:fldCharType="begin"/>
-          <w:instrText xml:space="preserve"> PAGEREF _Toc0000053 \h </w:instrText>
-          <w:fldChar w:fldCharType="separate"/>
-        </w:r>
-        <w:r>
-          <w:rPr>
-            <w:noProof/>
-            <w:color w:val="475569"/>
-            <w:sz w:val="19"/>
-            <w:szCs w:val="19"/>
-          </w:rPr>
-          <w:t>24</w:t>
-        </w:r>
-        <w:r>
-          <w:rPr>
-            <w:color w:val="475569"/>
-            <w:sz w:val="19"/>
-            <w:szCs w:val="19"/>
-          </w:rPr>
-          <w:fldChar w:fldCharType="end"/>
-        </w:r>
-      </w:hyperlink>
-    </w:p>
-    <w:p>
-      <w:pPr>
-        <w:tabs>
-          <w:tab w:val="right" w:leader="dot" w:pos="10080"/>
-        </w:tabs>
-        <w:spacing w:after="70"/>
-        <w:ind w:left="260"/>
-      </w:pPr>
-      <w:hyperlink w:anchor="_Toc0000054" w:history="1">
-        <w:r>
-          <w:rPr>
-            <w:color w:val="475569"/>
-            <w:sz w:val="19"/>
-            <w:szCs w:val="19"/>
-          </w:rPr>
-          <w:t>10.4 The Current Interface</w:t>
-          <w:tab/>
-          <w:fldChar w:fldCharType="begin"/>
-          <w:instrText xml:space="preserve"> PAGEREF _Toc0000054 \h </w:instrText>
-          <w:fldChar w:fldCharType="separate"/>
-        </w:r>
-        <w:r>
-          <w:rPr>
-            <w:noProof/>
-            <w:color w:val="475569"/>
-            <w:sz w:val="19"/>
-            <w:szCs w:val="19"/>
-          </w:rPr>
-          <w:t>25</w:t>
-        </w:r>
-        <w:r>
-          <w:rPr>
-            <w:color w:val="475569"/>
-            <w:sz w:val="19"/>
-            <w:szCs w:val="19"/>
-          </w:rPr>
-          <w:fldChar w:fldCharType="end"/>
-        </w:r>
-      </w:hyperlink>
-    </w:p>
-    <w:p>
-      <w:pPr>
-        <w:tabs>
-          <w:tab w:val="right" w:leader="dot" w:pos="10080"/>
-        </w:tabs>
-        <w:spacing w:after="70"/>
-        <w:ind w:left="260"/>
-      </w:pPr>
-      <w:hyperlink w:anchor="_Toc0000055" w:history="1">
-        <w:r>
-          <w:rPr>
-            <w:color w:val="475569"/>
-            <w:sz w:val="19"/>
-            <w:szCs w:val="19"/>
-          </w:rPr>
-          <w:t>10.5 Updated Demo Accounts and Data</w:t>
-          <w:tab/>
-          <w:fldChar w:fldCharType="begin"/>
-          <w:instrText xml:space="preserve"> PAGEREF _Toc0000055 \h </w:instrText>
-          <w:fldChar w:fldCharType="separate"/>
-        </w:r>
-        <w:r>
-          <w:rPr>
-            <w:noProof/>
-            <w:color w:val="475569"/>
-            <w:sz w:val="19"/>
-            <w:szCs w:val="19"/>
-          </w:rPr>
-          <w:t>27</w:t>
-        </w:r>
-        <w:r>
-          <w:rPr>
-            <w:color w:val="475569"/>
-            <w:sz w:val="19"/>
-            <w:szCs w:val="19"/>
           </w:rPr>
           <w:fldChar w:fldCharType="end"/>
         </w:r>
@@ -1967,7 +1731,7 @@
             <w:noProof/>
             <w:color w:val="0F172A"/>
           </w:rPr>
-          <w:t>27</w:t>
+          <w:t>1</w:t>
         </w:r>
         <w:r>
           <w:rPr>
@@ -2006,7 +1770,7 @@
             <w:sz w:val="19"/>
             <w:szCs w:val="19"/>
           </w:rPr>
-          <w:t>27</w:t>
+          <w:t>1</w:t>
         </w:r>
         <w:r>
           <w:rPr>
@@ -2046,7 +1810,7 @@
             <w:sz w:val="19"/>
             <w:szCs w:val="19"/>
           </w:rPr>
-          <w:t>27</w:t>
+          <w:t>1</w:t>
         </w:r>
         <w:r>
           <w:rPr>
@@ -2086,7 +1850,7 @@
             <w:sz w:val="19"/>
             <w:szCs w:val="19"/>
           </w:rPr>
-          <w:t>28</w:t>
+          <w:t>1</w:t>
         </w:r>
         <w:r>
           <w:rPr>
@@ -2126,7 +1890,7 @@
             <w:sz w:val="19"/>
             <w:szCs w:val="19"/>
           </w:rPr>
-          <w:t>28</w:t>
+          <w:t>1</w:t>
         </w:r>
         <w:r>
           <w:rPr>
@@ -2156,18 +1920,6 @@
         <w:t>1. Executive Summary</w:t>
       </w:r>
       <w:bookmarkEnd w:id="0"/>
-    </w:p>
-    <w:p>
-      <w:pPr>
-        <w:spacing w:after="100"/>
-      </w:pPr>
-      <w:r>
-        <w:rPr>
-          <w:i/>
-          <w:color w:val="1E293B"/>
-        </w:rPr>
-        <w:t>Note: this document records RentalPro as submitted for Deliverable 3, and every figure in it (93 tests, 77% coverage, 31 templates) is that of the system at the time. Section 10 summarises everything added since — the eleven gaps closed in Deliverable 5, the billing engine, the redesigned Harare interface, English, Shona and Arabic, and production hardening — with today's figures (18 tables, 298 tests, 85% coverage).</w:t>
-      </w:r>
     </w:p>
     <w:p>
       <w:pPr>
@@ -22297,2815 +22049,6 @@
       <w:r>
         <w:br w:type="page"/>
       </w:r>
-    </w:p>
-    <w:p>
-      <w:r>
-        <w:br w:type="page"/>
-      </w:r>
-    </w:p>
-    <w:p>
-      <w:pPr>
-        <w:pStyle w:val="Heading1"/>
-        <w:pBdr>
-          <w:bottom w:val="single" w:sz="8" w:space="4" w:color="2563EB"/>
-        </w:pBdr>
-      </w:pPr>
-      <w:bookmarkStart w:id="950" w:name="_Toc0000050"/>
-      <w:r>
-        <w:t>10. Updates Since Deliverable 3 (October 2026)</w:t>
-      </w:r>
-      <w:bookmarkEnd w:id="950"/>
-    </w:p>
-    <w:p>
-      <w:pPr>
-        <w:spacing w:after="100"/>
-      </w:pPr>
-      <w:r>
-        <w:rPr>
-          <w:color w:val="1E293B"/>
-        </w:rPr>
-        <w:t>This section brings the document up to date. The rest of the document describes RentalPro as submitted for Deliverable 3, and its figures are deliberately left as they were at that time. Since then, Deliverable 5 closed eleven gaps against the SRS, and the system has gained a billing engine, a property map, a redesigned interface, English, Shona and Arabic interface languages, Harare demonstration data, a tenant history page for each unit and a maintenance summary report, and finally full Arabic and production hardening. Each change was made additively, behind the existing test suite, with new tests of its own.</w:t>
-      </w:r>
-    </w:p>
-    <w:p>
-      <w:pPr>
-        <w:pStyle w:val="Heading2"/>
-        <w:keepNext/>
-      </w:pPr>
-      <w:bookmarkStart w:id="951" w:name="_Toc0000051"/>
-      <w:r>
-        <w:t xml:space="preserve">10.1 Summary of Changes</w:t>
-      </w:r>
-      <w:bookmarkEnd w:id="951"/>
-    </w:p>
-    <w:tbl>
-      <w:tblPr>
-        <w:tblW w:w="9360" w:type="dxa"/>
-        <w:tblBorders>
-          <w:top w:val="single" w:sz="4" w:space="0" w:color="CBD5E1"/>
-          <w:left w:val="nil"/>
-          <w:bottom w:val="single" w:sz="4" w:space="0" w:color="CBD5E1"/>
-          <w:right w:val="nil"/>
-          <w:insideH w:val="single" w:sz="4" w:space="0" w:color="CBD5E1"/>
-          <w:insideV w:val="nil"/>
-        </w:tblBorders>
-        <w:tblCellMar>
-          <w:left w:w="10" w:type="dxa"/>
-          <w:right w:w="10" w:type="dxa"/>
-        </w:tblCellMar>
-      </w:tblPr>
-      <w:tblGrid>
-        <w:gridCol w:w="1900"/>
-        <w:gridCol w:w="6260"/>
-        <w:gridCol w:w="1200"/>
-      </w:tblGrid>
-      <w:tr>
-        <w:trPr>
-          <w:tblHeader/>
-        </w:trPr>
-        <w:tc>
-          <w:tcPr>
-            <w:tcW w:w="1900" w:type="dxa"/>
-            <w:tcBorders>
-              <w:top w:val="single" w:sz="4" w:space="0" w:color="E2E8F0"/>
-              <w:left w:val="nil"/>
-              <w:bottom w:val="single" w:sz="4" w:space="0" w:color="E2E8F0"/>
-              <w:right w:val="nil"/>
-            </w:tcBorders>
-            <w:shd w:val="clear" w:color="auto" w:fill="0F172A"/>
-            <w:tcMar>
-              <w:top w:w="90" w:type="dxa"/>
-              <w:left w:w="160" w:type="dxa"/>
-              <w:bottom w:w="90" w:type="dxa"/>
-              <w:right w:w="160" w:type="dxa"/>
-            </w:tcMar>
-            <w:vAlign w:val="center"/>
-          </w:tcPr>
-          <w:p>
-            <w:r>
-              <w:rPr>
-                <w:b/>
-                <w:bCs/>
-                <w:color w:val="FFFFFF"/>
-                <w:sz w:val="18"/>
-                <w:szCs w:val="18"/>
-              </w:rPr>
-              <w:t xml:space="preserve">Area</w:t>
-            </w:r>
-          </w:p>
-        </w:tc>
-        <w:tc>
-          <w:tcPr>
-            <w:tcW w:w="6260" w:type="dxa"/>
-            <w:tcBorders>
-              <w:top w:val="single" w:sz="4" w:space="0" w:color="E2E8F0"/>
-              <w:left w:val="nil"/>
-              <w:bottom w:val="single" w:sz="4" w:space="0" w:color="E2E8F0"/>
-              <w:right w:val="nil"/>
-            </w:tcBorders>
-            <w:shd w:val="clear" w:color="auto" w:fill="0F172A"/>
-            <w:tcMar>
-              <w:top w:w="90" w:type="dxa"/>
-              <w:left w:w="160" w:type="dxa"/>
-              <w:bottom w:w="90" w:type="dxa"/>
-              <w:right w:w="160" w:type="dxa"/>
-            </w:tcMar>
-            <w:vAlign w:val="center"/>
-          </w:tcPr>
-          <w:p>
-            <w:r>
-              <w:rPr>
-                <w:b/>
-                <w:bCs/>
-                <w:color w:val="FFFFFF"/>
-                <w:sz w:val="18"/>
-                <w:szCs w:val="18"/>
-              </w:rPr>
-              <w:t xml:space="preserve">What changed</w:t>
-            </w:r>
-          </w:p>
-        </w:tc>
-        <w:tc>
-          <w:tcPr>
-            <w:tcW w:w="1200" w:type="dxa"/>
-            <w:tcBorders>
-              <w:top w:val="single" w:sz="4" w:space="0" w:color="E2E8F0"/>
-              <w:left w:val="nil"/>
-              <w:bottom w:val="single" w:sz="4" w:space="0" w:color="E2E8F0"/>
-              <w:right w:val="nil"/>
-            </w:tcBorders>
-            <w:shd w:val="clear" w:color="auto" w:fill="0F172A"/>
-            <w:tcMar>
-              <w:top w:w="90" w:type="dxa"/>
-              <w:left w:w="160" w:type="dxa"/>
-              <w:bottom w:w="90" w:type="dxa"/>
-              <w:right w:w="160" w:type="dxa"/>
-            </w:tcMar>
-            <w:vAlign w:val="center"/>
-          </w:tcPr>
-          <w:p>
-            <w:r>
-              <w:rPr>
-                <w:b/>
-                <w:bCs/>
-                <w:color w:val="FFFFFF"/>
-                <w:sz w:val="18"/>
-                <w:szCs w:val="18"/>
-              </w:rPr>
-              <w:t xml:space="preserve">New tests</w:t>
-            </w:r>
-          </w:p>
-        </w:tc>
-      </w:tr>
-      <w:tr>
-        <w:tc>
-          <w:tcPr>
-            <w:tcW w:w="1900" w:type="dxa"/>
-            <w:tcBorders>
-              <w:top w:val="single" w:sz="4" w:space="0" w:color="E2E8F0"/>
-              <w:left w:val="nil"/>
-              <w:bottom w:val="single" w:sz="4" w:space="0" w:color="E2E8F0"/>
-              <w:right w:val="nil"/>
-            </w:tcBorders>
-            <w:shd w:val="clear" w:color="auto" w:fill="FFFFFF"/>
-            <w:tcMar>
-              <w:top w:w="90" w:type="dxa"/>
-              <w:left w:w="160" w:type="dxa"/>
-              <w:bottom w:w="90" w:type="dxa"/>
-              <w:right w:w="160" w:type="dxa"/>
-            </w:tcMar>
-            <w:vAlign w:val="center"/>
-          </w:tcPr>
-          <w:p>
-            <w:r>
-              <w:rPr>
-                <w:color w:val="1E293B"/>
-                <w:sz w:val="18"/>
-                <w:szCs w:val="18"/>
-              </w:rPr>
-              <w:t>Deliverable 5</w:t>
-            </w:r>
-          </w:p>
-        </w:tc>
-        <w:tc>
-          <w:tcPr>
-            <w:tcW w:w="6260" w:type="dxa"/>
-            <w:tcBorders>
-              <w:top w:val="single" w:sz="4" w:space="0" w:color="E2E8F0"/>
-              <w:left w:val="nil"/>
-              <w:bottom w:val="single" w:sz="4" w:space="0" w:color="E2E8F0"/>
-              <w:right w:val="nil"/>
-            </w:tcBorders>
-            <w:shd w:val="clear" w:color="auto" w:fill="FFFFFF"/>
-            <w:tcMar>
-              <w:top w:w="90" w:type="dxa"/>
-              <w:left w:w="160" w:type="dxa"/>
-              <w:bottom w:w="90" w:type="dxa"/>
-              <w:right w:w="160" w:type="dxa"/>
-            </w:tcMar>
-            <w:vAlign w:val="center"/>
-          </w:tcPr>
-          <w:p>
-            <w:r>
-              <w:rPr>
-                <w:color w:val="1E293B"/>
-                <w:sz w:val="18"/>
-                <w:szCs w:val="18"/>
-              </w:rPr>
-              <w:t>Eleven gaps against the SRS closed: editing units; property, unit and maintenance photos; tenant ID documents; lease document download; tenant blacklisting; administrator user and role management; staff account creation; configurable late fees; CSV and Excel exports.</w:t>
-            </w:r>
-          </w:p>
-        </w:tc>
-        <w:tc>
-          <w:tcPr>
-            <w:tcW w:w="1200" w:type="dxa"/>
-            <w:tcBorders>
-              <w:top w:val="single" w:sz="4" w:space="0" w:color="E2E8F0"/>
-              <w:left w:val="nil"/>
-              <w:bottom w:val="single" w:sz="4" w:space="0" w:color="E2E8F0"/>
-              <w:right w:val="nil"/>
-            </w:tcBorders>
-            <w:shd w:val="clear" w:color="auto" w:fill="FFFFFF"/>
-            <w:tcMar>
-              <w:top w:w="90" w:type="dxa"/>
-              <w:left w:w="160" w:type="dxa"/>
-              <w:bottom w:w="90" w:type="dxa"/>
-              <w:right w:w="160" w:type="dxa"/>
-            </w:tcMar>
-            <w:vAlign w:val="center"/>
-          </w:tcPr>
-          <w:p>
-            <w:r>
-              <w:rPr>
-                <w:color w:val="1E293B"/>
-                <w:sz w:val="18"/>
-                <w:szCs w:val="18"/>
-              </w:rPr>
-              <w:t>31</w:t>
-            </w:r>
-          </w:p>
-        </w:tc>
-      </w:tr>
-      <w:tr>
-        <w:tc>
-          <w:tcPr>
-            <w:tcW w:w="1900" w:type="dxa"/>
-            <w:tcBorders>
-              <w:top w:val="single" w:sz="4" w:space="0" w:color="E2E8F0"/>
-              <w:left w:val="nil"/>
-              <w:bottom w:val="single" w:sz="4" w:space="0" w:color="E2E8F0"/>
-              <w:right w:val="nil"/>
-            </w:tcBorders>
-            <w:shd w:val="clear" w:color="auto" w:fill="FFFFFF"/>
-            <w:tcMar>
-              <w:top w:w="90" w:type="dxa"/>
-              <w:left w:w="160" w:type="dxa"/>
-              <w:bottom w:w="90" w:type="dxa"/>
-              <w:right w:w="160" w:type="dxa"/>
-            </w:tcMar>
-            <w:vAlign w:val="center"/>
-          </w:tcPr>
-          <w:p>
-            <w:r>
-              <w:rPr>
-                <w:color w:val="1E293B"/>
-                <w:sz w:val="18"/>
-                <w:szCs w:val="18"/>
-              </w:rPr>
-              <w:t xml:space="preserve">Billing engine</w:t>
-            </w:r>
-          </w:p>
-        </w:tc>
-        <w:tc>
-          <w:tcPr>
-            <w:tcW w:w="6260" w:type="dxa"/>
-            <w:tcBorders>
-              <w:top w:val="single" w:sz="4" w:space="0" w:color="E2E8F0"/>
-              <w:left w:val="nil"/>
-              <w:bottom w:val="single" w:sz="4" w:space="0" w:color="E2E8F0"/>
-              <w:right w:val="nil"/>
-            </w:tcBorders>
-            <w:shd w:val="clear" w:color="auto" w:fill="FFFFFF"/>
-            <w:tcMar>
-              <w:top w:w="90" w:type="dxa"/>
-              <w:left w:w="160" w:type="dxa"/>
-              <w:bottom w:w="90" w:type="dxa"/>
-              <w:right w:w="160" w:type="dxa"/>
-            </w:tcMar>
-            <w:vAlign w:val="center"/>
-          </w:tcPr>
-          <w:p>
-            <w:r>
-              <w:rPr>
-                <w:color w:val="1E293B"/>
-                <w:sz w:val="18"/>
-                <w:szCs w:val="18"/>
-              </w:rPr>
-              <w:t xml:space="preserve">Charges and sundries, electricity metering, pro rata first month, variable/escalating rent, automated recurring billing (a fifth scheduler job), statements by period, PDF payment receipts, and property expenses with net income. Five new tables: lease_charges, meter_readings, rent_revisions, rent_invoices, property_expenses.</w:t>
-            </w:r>
-          </w:p>
-        </w:tc>
-        <w:tc>
-          <w:tcPr>
-            <w:tcW w:w="1200" w:type="dxa"/>
-            <w:tcBorders>
-              <w:top w:val="single" w:sz="4" w:space="0" w:color="E2E8F0"/>
-              <w:left w:val="nil"/>
-              <w:bottom w:val="single" w:sz="4" w:space="0" w:color="E2E8F0"/>
-              <w:right w:val="nil"/>
-            </w:tcBorders>
-            <w:shd w:val="clear" w:color="auto" w:fill="FFFFFF"/>
-            <w:tcMar>
-              <w:top w:w="90" w:type="dxa"/>
-              <w:left w:w="160" w:type="dxa"/>
-              <w:bottom w:w="90" w:type="dxa"/>
-              <w:right w:w="160" w:type="dxa"/>
-            </w:tcMar>
-            <w:vAlign w:val="center"/>
-          </w:tcPr>
-          <w:p>
-            <w:r>
-              <w:rPr>
-                <w:color w:val="1E293B"/>
-                <w:sz w:val="18"/>
-                <w:szCs w:val="18"/>
-              </w:rPr>
-              <w:t xml:space="preserve">79</w:t>
-            </w:r>
-          </w:p>
-        </w:tc>
-      </w:tr>
-      <w:tr>
-        <w:tc>
-          <w:tcPr>
-            <w:tcW w:w="1900" w:type="dxa"/>
-            <w:tcBorders>
-              <w:top w:val="single" w:sz="4" w:space="0" w:color="E2E8F0"/>
-              <w:left w:val="nil"/>
-              <w:bottom w:val="single" w:sz="4" w:space="0" w:color="E2E8F0"/>
-              <w:right w:val="nil"/>
-            </w:tcBorders>
-            <w:shd w:val="clear" w:color="auto" w:fill="F8FAFC"/>
-            <w:tcMar>
-              <w:top w:w="90" w:type="dxa"/>
-              <w:left w:w="160" w:type="dxa"/>
-              <w:bottom w:w="90" w:type="dxa"/>
-              <w:right w:w="160" w:type="dxa"/>
-            </w:tcMar>
-            <w:vAlign w:val="center"/>
-          </w:tcPr>
-          <w:p>
-            <w:r>
-              <w:rPr>
-                <w:color w:val="1E293B"/>
-                <w:sz w:val="18"/>
-                <w:szCs w:val="18"/>
-              </w:rPr>
-              <w:t xml:space="preserve">Property map</w:t>
-            </w:r>
-          </w:p>
-        </w:tc>
-        <w:tc>
-          <w:tcPr>
-            <w:tcW w:w="6260" w:type="dxa"/>
-            <w:tcBorders>
-              <w:top w:val="single" w:sz="4" w:space="0" w:color="E2E8F0"/>
-              <w:left w:val="nil"/>
-              <w:bottom w:val="single" w:sz="4" w:space="0" w:color="E2E8F0"/>
-              <w:right w:val="nil"/>
-            </w:tcBorders>
-            <w:shd w:val="clear" w:color="auto" w:fill="F8FAFC"/>
-            <w:tcMar>
-              <w:top w:w="90" w:type="dxa"/>
-              <w:left w:w="160" w:type="dxa"/>
-              <w:bottom w:w="90" w:type="dxa"/>
-              <w:right w:w="160" w:type="dxa"/>
-            </w:tcMar>
-            <w:vAlign w:val="center"/>
-          </w:tcPr>
-          <w:p>
-            <w:r>
-              <w:rPr>
-                <w:color w:val="1E293B"/>
-                <w:sz w:val="18"/>
-                <w:szCs w:val="18"/>
-              </w:rPr>
-              <w:t xml:space="preserve">Map coordinates on each property, set by clicking a map on the Add/Edit forms; a pin on the property page and a portfolio map at /properties/map. Leaflet is bundled with the app, not loaded from a CDN.</w:t>
-            </w:r>
-          </w:p>
-        </w:tc>
-        <w:tc>
-          <w:tcPr>
-            <w:tcW w:w="1200" w:type="dxa"/>
-            <w:tcBorders>
-              <w:top w:val="single" w:sz="4" w:space="0" w:color="E2E8F0"/>
-              <w:left w:val="nil"/>
-              <w:bottom w:val="single" w:sz="4" w:space="0" w:color="E2E8F0"/>
-              <w:right w:val="nil"/>
-            </w:tcBorders>
-            <w:shd w:val="clear" w:color="auto" w:fill="F8FAFC"/>
-            <w:tcMar>
-              <w:top w:w="90" w:type="dxa"/>
-              <w:left w:w="160" w:type="dxa"/>
-              <w:bottom w:w="90" w:type="dxa"/>
-              <w:right w:w="160" w:type="dxa"/>
-            </w:tcMar>
-            <w:vAlign w:val="center"/>
-          </w:tcPr>
-          <w:p>
-            <w:r>
-              <w:rPr>
-                <w:color w:val="1E293B"/>
-                <w:sz w:val="18"/>
-                <w:szCs w:val="18"/>
-              </w:rPr>
-              <w:t xml:space="preserve">8</w:t>
-            </w:r>
-          </w:p>
-        </w:tc>
-      </w:tr>
-      <w:tr>
-        <w:tc>
-          <w:tcPr>
-            <w:tcW w:w="1900" w:type="dxa"/>
-            <w:tcBorders>
-              <w:top w:val="single" w:sz="4" w:space="0" w:color="E2E8F0"/>
-              <w:left w:val="nil"/>
-              <w:bottom w:val="single" w:sz="4" w:space="0" w:color="E2E8F0"/>
-              <w:right w:val="nil"/>
-            </w:tcBorders>
-            <w:shd w:val="clear" w:color="auto" w:fill="FFFFFF"/>
-            <w:tcMar>
-              <w:top w:w="90" w:type="dxa"/>
-              <w:left w:w="160" w:type="dxa"/>
-              <w:bottom w:w="90" w:type="dxa"/>
-              <w:right w:w="160" w:type="dxa"/>
-            </w:tcMar>
-            <w:vAlign w:val="center"/>
-          </w:tcPr>
-          <w:p>
-            <w:r>
-              <w:rPr>
-                <w:color w:val="1E293B"/>
-                <w:sz w:val="18"/>
-                <w:szCs w:val="18"/>
-              </w:rPr>
-              <w:t xml:space="preserve">Interface redesign</w:t>
-            </w:r>
-          </w:p>
-        </w:tc>
-        <w:tc>
-          <w:tcPr>
-            <w:tcW w:w="6260" w:type="dxa"/>
-            <w:tcBorders>
-              <w:top w:val="single" w:sz="4" w:space="0" w:color="E2E8F0"/>
-              <w:left w:val="nil"/>
-              <w:bottom w:val="single" w:sz="4" w:space="0" w:color="E2E8F0"/>
-              <w:right w:val="nil"/>
-            </w:tcBorders>
-            <w:shd w:val="clear" w:color="auto" w:fill="FFFFFF"/>
-            <w:tcMar>
-              <w:top w:w="90" w:type="dxa"/>
-              <w:left w:w="160" w:type="dxa"/>
-              <w:bottom w:w="90" w:type="dxa"/>
-              <w:right w:w="160" w:type="dxa"/>
-            </w:tcMar>
-            <w:vAlign w:val="center"/>
-          </w:tcPr>
-          <w:p>
-            <w:r>
-              <w:rPr>
-                <w:color w:val="1E293B"/>
-                <w:sz w:val="18"/>
-                <w:szCs w:val="18"/>
-              </w:rPr>
-              <w:t xml:space="preserve">The sidebar was replaced by a horizontal top navigation bar. The login page is a full-screen photograph of the Harare skyline, and each section of the app has its own Harare photograph behind it, with solid white cards and white page titles.</w:t>
-            </w:r>
-          </w:p>
-        </w:tc>
-        <w:tc>
-          <w:tcPr>
-            <w:tcW w:w="1200" w:type="dxa"/>
-            <w:tcBorders>
-              <w:top w:val="single" w:sz="4" w:space="0" w:color="E2E8F0"/>
-              <w:left w:val="nil"/>
-              <w:bottom w:val="single" w:sz="4" w:space="0" w:color="E2E8F0"/>
-              <w:right w:val="nil"/>
-            </w:tcBorders>
-            <w:shd w:val="clear" w:color="auto" w:fill="FFFFFF"/>
-            <w:tcMar>
-              <w:top w:w="90" w:type="dxa"/>
-              <w:left w:w="160" w:type="dxa"/>
-              <w:bottom w:w="90" w:type="dxa"/>
-              <w:right w:w="160" w:type="dxa"/>
-            </w:tcMar>
-            <w:vAlign w:val="center"/>
-          </w:tcPr>
-          <w:p>
-            <w:r>
-              <w:rPr>
-                <w:color w:val="1E293B"/>
-                <w:sz w:val="18"/>
-                <w:szCs w:val="18"/>
-              </w:rPr>
-              <w:t xml:space="preserve">—</w:t>
-            </w:r>
-          </w:p>
-        </w:tc>
-      </w:tr>
-      <w:tr>
-        <w:tc>
-          <w:tcPr>
-            <w:tcW w:w="1900" w:type="dxa"/>
-            <w:tcBorders>
-              <w:top w:val="single" w:sz="4" w:space="0" w:color="E2E8F0"/>
-              <w:left w:val="nil"/>
-              <w:bottom w:val="single" w:sz="4" w:space="0" w:color="E2E8F0"/>
-              <w:right w:val="nil"/>
-            </w:tcBorders>
-            <w:shd w:val="clear" w:color="auto" w:fill="F8FAFC"/>
-            <w:tcMar>
-              <w:top w:w="90" w:type="dxa"/>
-              <w:left w:w="160" w:type="dxa"/>
-              <w:bottom w:w="90" w:type="dxa"/>
-              <w:right w:w="160" w:type="dxa"/>
-            </w:tcMar>
-            <w:vAlign w:val="center"/>
-          </w:tcPr>
-          <w:p>
-            <w:r>
-              <w:rPr>
-                <w:color w:val="1E293B"/>
-                <w:sz w:val="18"/>
-                <w:szCs w:val="18"/>
-              </w:rPr>
-              <w:t xml:space="preserve">Languages</w:t>
-            </w:r>
-          </w:p>
-        </w:tc>
-        <w:tc>
-          <w:tcPr>
-            <w:tcW w:w="6260" w:type="dxa"/>
-            <w:tcBorders>
-              <w:top w:val="single" w:sz="4" w:space="0" w:color="E2E8F0"/>
-              <w:left w:val="nil"/>
-              <w:bottom w:val="single" w:sz="4" w:space="0" w:color="E2E8F0"/>
-              <w:right w:val="nil"/>
-            </w:tcBorders>
-            <w:shd w:val="clear" w:color="auto" w:fill="F8FAFC"/>
-            <w:tcMar>
-              <w:top w:w="90" w:type="dxa"/>
-              <w:left w:w="160" w:type="dxa"/>
-              <w:bottom w:w="90" w:type="dxa"/>
-              <w:right w:w="160" w:type="dxa"/>
-            </w:tcMar>
-            <w:vAlign w:val="center"/>
-          </w:tcPr>
-          <w:p>
-            <w:r>
-              <w:rPr>
-                <w:color w:val="1E293B"/>
-                <w:sz w:val="18"/>
-                <w:szCs w:val="18"/>
-              </w:rPr>
-              <w:t xml:space="preserve">A language menu in the top bar and on the login page shows the current language and opens a list of English, ChiShona and Arabic; a small translator (backend/i18n.py) with an English fallback; Arabic pages switch to a right-to-left layout; the choice survives logging in and out. Names and places are never translated.</w:t>
-            </w:r>
-          </w:p>
-        </w:tc>
-        <w:tc>
-          <w:tcPr>
-            <w:tcW w:w="1200" w:type="dxa"/>
-            <w:tcBorders>
-              <w:top w:val="single" w:sz="4" w:space="0" w:color="E2E8F0"/>
-              <w:left w:val="nil"/>
-              <w:bottom w:val="single" w:sz="4" w:space="0" w:color="E2E8F0"/>
-              <w:right w:val="nil"/>
-            </w:tcBorders>
-            <w:shd w:val="clear" w:color="auto" w:fill="F8FAFC"/>
-            <w:tcMar>
-              <w:top w:w="90" w:type="dxa"/>
-              <w:left w:w="160" w:type="dxa"/>
-              <w:bottom w:w="90" w:type="dxa"/>
-              <w:right w:w="160" w:type="dxa"/>
-            </w:tcMar>
-            <w:vAlign w:val="center"/>
-          </w:tcPr>
-          <w:p>
-            <w:r>
-              <w:rPr>
-                <w:color w:val="1E293B"/>
-                <w:sz w:val="18"/>
-                <w:szCs w:val="18"/>
-              </w:rPr>
-              <w:t xml:space="preserve">14</w:t>
-            </w:r>
-          </w:p>
-        </w:tc>
-      </w:tr>
-      <w:tr>
-        <w:tc>
-          <w:tcPr>
-            <w:tcW w:w="1900" w:type="dxa"/>
-            <w:tcBorders>
-              <w:top w:val="single" w:sz="4" w:space="0" w:color="E2E8F0"/>
-              <w:left w:val="nil"/>
-              <w:bottom w:val="single" w:sz="4" w:space="0" w:color="E2E8F0"/>
-              <w:right w:val="nil"/>
-            </w:tcBorders>
-            <w:shd w:val="clear" w:color="auto" w:fill="FFFFFF"/>
-            <w:tcMar>
-              <w:top w:w="90" w:type="dxa"/>
-              <w:left w:w="160" w:type="dxa"/>
-              <w:bottom w:w="90" w:type="dxa"/>
-              <w:right w:w="160" w:type="dxa"/>
-            </w:tcMar>
-            <w:vAlign w:val="center"/>
-          </w:tcPr>
-          <w:p>
-            <w:r>
-              <w:rPr>
-                <w:color w:val="1E293B"/>
-                <w:sz w:val="18"/>
-                <w:szCs w:val="18"/>
-              </w:rPr>
-              <w:t xml:space="preserve">Tenant unit labels</w:t>
-            </w:r>
-          </w:p>
-        </w:tc>
-        <w:tc>
-          <w:tcPr>
-            <w:tcW w:w="6260" w:type="dxa"/>
-            <w:tcBorders>
-              <w:top w:val="single" w:sz="4" w:space="0" w:color="E2E8F0"/>
-              <w:left w:val="nil"/>
-              <w:bottom w:val="single" w:sz="4" w:space="0" w:color="E2E8F0"/>
-              <w:right w:val="nil"/>
-            </w:tcBorders>
-            <w:shd w:val="clear" w:color="auto" w:fill="FFFFFF"/>
-            <w:tcMar>
-              <w:top w:w="90" w:type="dxa"/>
-              <w:left w:w="160" w:type="dxa"/>
-              <w:bottom w:w="90" w:type="dxa"/>
-              <w:right w:w="160" w:type="dxa"/>
-            </w:tcMar>
-            <w:vAlign w:val="center"/>
-          </w:tcPr>
-          <w:p>
-            <w:r>
-              <w:rPr>
-                <w:color w:val="1E293B"/>
-                <w:sz w:val="18"/>
-                <w:szCs w:val="18"/>
-              </w:rPr>
-              <w:t xml:space="preserve">The tenant dashboard and Pay Rent page show “Avondale Heights · Unit 101” instead of the internal unit code.</w:t>
-            </w:r>
-          </w:p>
-        </w:tc>
-        <w:tc>
-          <w:tcPr>
-            <w:tcW w:w="1200" w:type="dxa"/>
-            <w:tcBorders>
-              <w:top w:val="single" w:sz="4" w:space="0" w:color="E2E8F0"/>
-              <w:left w:val="nil"/>
-              <w:bottom w:val="single" w:sz="4" w:space="0" w:color="E2E8F0"/>
-              <w:right w:val="nil"/>
-            </w:tcBorders>
-            <w:shd w:val="clear" w:color="auto" w:fill="FFFFFF"/>
-            <w:tcMar>
-              <w:top w:w="90" w:type="dxa"/>
-              <w:left w:w="160" w:type="dxa"/>
-              <w:bottom w:w="90" w:type="dxa"/>
-              <w:right w:w="160" w:type="dxa"/>
-            </w:tcMar>
-            <w:vAlign w:val="center"/>
-          </w:tcPr>
-          <w:p>
-            <w:r>
-              <w:rPr>
-                <w:color w:val="1E293B"/>
-                <w:sz w:val="18"/>
-                <w:szCs w:val="18"/>
-              </w:rPr>
-              <w:t xml:space="preserve">1</w:t>
-            </w:r>
-          </w:p>
-        </w:tc>
-      </w:tr>
-      <w:tr>
-        <w:tc>
-          <w:tcPr>
-            <w:tcW w:w="1900" w:type="dxa"/>
-            <w:tcBorders>
-              <w:top w:val="single" w:sz="4" w:space="0" w:color="E2E8F0"/>
-              <w:left w:val="nil"/>
-              <w:bottom w:val="single" w:sz="4" w:space="0" w:color="E2E8F0"/>
-              <w:right w:val="nil"/>
-            </w:tcBorders>
-            <w:shd w:val="clear" w:color="auto" w:fill="F8FAFC"/>
-            <w:tcMar>
-              <w:top w:w="90" w:type="dxa"/>
-              <w:left w:w="160" w:type="dxa"/>
-              <w:bottom w:w="90" w:type="dxa"/>
-              <w:right w:w="160" w:type="dxa"/>
-            </w:tcMar>
-            <w:vAlign w:val="center"/>
-          </w:tcPr>
-          <w:p>
-            <w:r>
-              <w:rPr>
-                <w:color w:val="1E293B"/>
-                <w:sz w:val="18"/>
-                <w:szCs w:val="18"/>
-              </w:rPr>
-              <w:t xml:space="preserve">Logged-in redirect</w:t>
-            </w:r>
-          </w:p>
-        </w:tc>
-        <w:tc>
-          <w:tcPr>
-            <w:tcW w:w="6260" w:type="dxa"/>
-            <w:tcBorders>
-              <w:top w:val="single" w:sz="4" w:space="0" w:color="E2E8F0"/>
-              <w:left w:val="nil"/>
-              <w:bottom w:val="single" w:sz="4" w:space="0" w:color="E2E8F0"/>
-              <w:right w:val="nil"/>
-            </w:tcBorders>
-            <w:shd w:val="clear" w:color="auto" w:fill="F8FAFC"/>
-            <w:tcMar>
-              <w:top w:w="90" w:type="dxa"/>
-              <w:left w:w="160" w:type="dxa"/>
-              <w:bottom w:w="90" w:type="dxa"/>
-              <w:right w:w="160" w:type="dxa"/>
-            </w:tcMar>
-            <w:vAlign w:val="center"/>
-          </w:tcPr>
-          <w:p>
-            <w:r>
-              <w:rPr>
-                <w:color w:val="1E293B"/>
-                <w:sz w:val="18"/>
-                <w:szCs w:val="18"/>
-              </w:rPr>
-              <w:t xml:space="preserve">Opening the home page, the login page, a reset link or an invitation link while signed in now goes to the user's own home page instead of an empty page.</w:t>
-            </w:r>
-          </w:p>
-        </w:tc>
-        <w:tc>
-          <w:tcPr>
-            <w:tcW w:w="1200" w:type="dxa"/>
-            <w:tcBorders>
-              <w:top w:val="single" w:sz="4" w:space="0" w:color="E2E8F0"/>
-              <w:left w:val="nil"/>
-              <w:bottom w:val="single" w:sz="4" w:space="0" w:color="E2E8F0"/>
-              <w:right w:val="nil"/>
-            </w:tcBorders>
-            <w:shd w:val="clear" w:color="auto" w:fill="F8FAFC"/>
-            <w:tcMar>
-              <w:top w:w="90" w:type="dxa"/>
-              <w:left w:w="160" w:type="dxa"/>
-              <w:bottom w:w="90" w:type="dxa"/>
-              <w:right w:w="160" w:type="dxa"/>
-            </w:tcMar>
-            <w:vAlign w:val="center"/>
-          </w:tcPr>
-          <w:p>
-            <w:r>
-              <w:rPr>
-                <w:color w:val="1E293B"/>
-                <w:sz w:val="18"/>
-                <w:szCs w:val="18"/>
-              </w:rPr>
-              <w:t xml:space="preserve">4</w:t>
-            </w:r>
-          </w:p>
-        </w:tc>
-      </w:tr>
-      <w:tr>
-        <w:tc>
-          <w:tcPr>
-            <w:tcW w:w="1900" w:type="dxa"/>
-            <w:tcBorders>
-              <w:top w:val="single" w:sz="4" w:space="0" w:color="E2E8F0"/>
-              <w:left w:val="nil"/>
-              <w:bottom w:val="single" w:sz="4" w:space="0" w:color="E2E8F0"/>
-              <w:right w:val="nil"/>
-            </w:tcBorders>
-            <w:shd w:val="clear" w:color="auto" w:fill="FFFFFF"/>
-            <w:tcMar>
-              <w:top w:w="90" w:type="dxa"/>
-              <w:left w:w="160" w:type="dxa"/>
-              <w:bottom w:w="90" w:type="dxa"/>
-              <w:right w:w="160" w:type="dxa"/>
-            </w:tcMar>
-            <w:vAlign w:val="center"/>
-          </w:tcPr>
-          <w:p>
-            <w:r>
-              <w:rPr>
-                <w:color w:val="1E293B"/>
-                <w:sz w:val="18"/>
-                <w:szCs w:val="18"/>
-              </w:rPr>
-              <w:t xml:space="preserve">Harare demo data</w:t>
-            </w:r>
-          </w:p>
-        </w:tc>
-        <w:tc>
-          <w:tcPr>
-            <w:tcW w:w="6260" w:type="dxa"/>
-            <w:tcBorders>
-              <w:top w:val="single" w:sz="4" w:space="0" w:color="E2E8F0"/>
-              <w:left w:val="nil"/>
-              <w:bottom w:val="single" w:sz="4" w:space="0" w:color="E2E8F0"/>
-              <w:right w:val="nil"/>
-            </w:tcBorders>
-            <w:shd w:val="clear" w:color="auto" w:fill="FFFFFF"/>
-            <w:tcMar>
-              <w:top w:w="90" w:type="dxa"/>
-              <w:left w:w="160" w:type="dxa"/>
-              <w:bottom w:w="90" w:type="dxa"/>
-              <w:right w:w="160" w:type="dxa"/>
-            </w:tcMar>
-            <w:vAlign w:val="center"/>
-          </w:tcPr>
-          <w:p>
-            <w:r>
-              <w:rPr>
-                <w:color w:val="1E293B"/>
-                <w:sz w:val="18"/>
-                <w:szCs w:val="18"/>
-              </w:rPr>
-              <w:t xml:space="preserve">Five properties in Avondale, the CBD, Eastlea and Vainona with map coordinates; 16 units; nine tenants with Zimbabwean names, national IDs and +263 phone numbers; payment histories with three tenants in arrears; the administrator account Abdur-Rahmaan Ali.</w:t>
-            </w:r>
-          </w:p>
-        </w:tc>
-        <w:tc>
-          <w:tcPr>
-            <w:tcW w:w="1200" w:type="dxa"/>
-            <w:tcBorders>
-              <w:top w:val="single" w:sz="4" w:space="0" w:color="E2E8F0"/>
-              <w:left w:val="nil"/>
-              <w:bottom w:val="single" w:sz="4" w:space="0" w:color="E2E8F0"/>
-              <w:right w:val="nil"/>
-            </w:tcBorders>
-            <w:shd w:val="clear" w:color="auto" w:fill="FFFFFF"/>
-            <w:tcMar>
-              <w:top w:w="90" w:type="dxa"/>
-              <w:left w:w="160" w:type="dxa"/>
-              <w:bottom w:w="90" w:type="dxa"/>
-              <w:right w:w="160" w:type="dxa"/>
-            </w:tcMar>
-            <w:vAlign w:val="center"/>
-          </w:tcPr>
-          <w:p>
-            <w:r>
-              <w:rPr>
-                <w:color w:val="1E293B"/>
-                <w:sz w:val="18"/>
-                <w:szCs w:val="18"/>
-              </w:rPr>
-              <w:t xml:space="preserve">—</w:t>
-            </w:r>
-          </w:p>
-        </w:tc>
-      </w:tr>
-      <w:tr>
-        <w:tc>
-          <w:tcPr>
-            <w:tcW w:w="1900" w:type="dxa"/>
-            <w:tcBorders>
-              <w:top w:val="single" w:sz="4" w:space="0" w:color="E2E8F0"/>
-              <w:left w:val="nil"/>
-              <w:bottom w:val="single" w:sz="4" w:space="0" w:color="E2E8F0"/>
-              <w:right w:val="nil"/>
-            </w:tcBorders>
-            <w:shd w:val="clear" w:color="auto" w:fill="F8FAFC"/>
-            <w:tcMar>
-              <w:top w:w="90" w:type="dxa"/>
-              <w:left w:w="160" w:type="dxa"/>
-              <w:bottom w:w="90" w:type="dxa"/>
-              <w:right w:w="160" w:type="dxa"/>
-            </w:tcMar>
-            <w:vAlign w:val="center"/>
-          </w:tcPr>
-          <w:p>
-            <w:r>
-              <w:rPr>
-                <w:color w:val="1E293B"/>
-                <w:sz w:val="18"/>
-                <w:szCs w:val="18"/>
-              </w:rPr>
-              <w:t xml:space="preserve">History &amp; summary</w:t>
-            </w:r>
-          </w:p>
-        </w:tc>
-        <w:tc>
-          <w:tcPr>
-            <w:tcW w:w="6260" w:type="dxa"/>
-            <w:tcBorders>
-              <w:top w:val="single" w:sz="4" w:space="0" w:color="E2E8F0"/>
-              <w:left w:val="nil"/>
-              <w:bottom w:val="single" w:sz="4" w:space="0" w:color="E2E8F0"/>
-              <w:right w:val="nil"/>
-            </w:tcBorders>
-            <w:shd w:val="clear" w:color="auto" w:fill="F8FAFC"/>
-            <w:tcMar>
-              <w:top w:w="90" w:type="dxa"/>
-              <w:left w:w="160" w:type="dxa"/>
-              <w:bottom w:w="90" w:type="dxa"/>
-              <w:right w:w="160" w:type="dxa"/>
-            </w:tcMar>
-            <w:vAlign w:val="center"/>
-          </w:tcPr>
-          <w:p>
-            <w:r>
-              <w:rPr>
-                <w:color w:val="1E293B"/>
-                <w:sz w:val="18"/>
-                <w:szCs w:val="18"/>
-              </w:rPr>
-              <w:t xml:space="preserve">A History page on every unit lists each tenant who has occupied it, newest first (FR-015); the Reports page has a Maintenance Summary of open, in-progress and closed requests per property for a chosen period (FR-036).</w:t>
-            </w:r>
-          </w:p>
-        </w:tc>
-        <w:tc>
-          <w:tcPr>
-            <w:tcW w:w="1200" w:type="dxa"/>
-            <w:tcBorders>
-              <w:top w:val="single" w:sz="4" w:space="0" w:color="E2E8F0"/>
-              <w:left w:val="nil"/>
-              <w:bottom w:val="single" w:sz="4" w:space="0" w:color="E2E8F0"/>
-              <w:right w:val="nil"/>
-            </w:tcBorders>
-            <w:shd w:val="clear" w:color="auto" w:fill="F8FAFC"/>
-            <w:tcMar>
-              <w:top w:w="90" w:type="dxa"/>
-              <w:left w:w="160" w:type="dxa"/>
-              <w:bottom w:w="90" w:type="dxa"/>
-              <w:right w:w="160" w:type="dxa"/>
-            </w:tcMar>
-            <w:vAlign w:val="center"/>
-          </w:tcPr>
-          <w:p>
-            <w:r>
-              <w:rPr>
-                <w:color w:val="1E293B"/>
-                <w:sz w:val="18"/>
-                <w:szCs w:val="18"/>
-              </w:rPr>
-              <w:t xml:space="preserve">13</w:t>
-            </w:r>
-          </w:p>
-        </w:tc>
-      </w:tr>
-      <w:tr>
-        <w:tc>
-          <w:tcPr>
-            <w:tcW w:w="1900" w:type="dxa"/>
-            <w:tcBorders>
-              <w:top w:val="single" w:sz="4" w:space="0" w:color="E2E8F0"/>
-              <w:left w:val="nil"/>
-              <w:bottom w:val="single" w:sz="4" w:space="0" w:color="E2E8F0"/>
-              <w:right w:val="nil"/>
-            </w:tcBorders>
-            <w:shd w:val="clear" w:color="auto" w:fill="FFFFFF"/>
-            <w:tcMar>
-              <w:top w:w="90" w:type="dxa"/>
-              <w:left w:w="160" w:type="dxa"/>
-              <w:bottom w:w="90" w:type="dxa"/>
-              <w:right w:w="160" w:type="dxa"/>
-            </w:tcMar>
-            <w:vAlign w:val="center"/>
-          </w:tcPr>
-          <w:p>
-            <w:r>
-              <w:rPr>
-                <w:color w:val="1E293B"/>
-                <w:sz w:val="18"/>
-                <w:szCs w:val="18"/>
-              </w:rPr>
-              <w:t>Full Arabic &amp; hardening</w:t>
-            </w:r>
-          </w:p>
-        </w:tc>
-        <w:tc>
-          <w:tcPr>
-            <w:tcW w:w="6260" w:type="dxa"/>
-            <w:tcBorders>
-              <w:top w:val="single" w:sz="4" w:space="0" w:color="E2E8F0"/>
-              <w:left w:val="nil"/>
-              <w:bottom w:val="single" w:sz="4" w:space="0" w:color="E2E8F0"/>
-              <w:right w:val="nil"/>
-            </w:tcBorders>
-            <w:shd w:val="clear" w:color="auto" w:fill="FFFFFF"/>
-            <w:tcMar>
-              <w:top w:w="90" w:type="dxa"/>
-              <w:left w:w="160" w:type="dxa"/>
-              <w:bottom w:w="90" w:type="dxa"/>
-              <w:right w:w="160" w:type="dxa"/>
-            </w:tcMar>
-            <w:vAlign w:val="center"/>
-          </w:tcPr>
-          <w:p>
-            <w:r>
-              <w:rPr>
-                <w:color w:val="1E293B"/>
-                <w:sz w:val="18"/>
-                <w:szCs w:val="18"/>
-              </w:rPr>
-              <w:t>Arabic on every page, message, email, SMS and PDF; each user's language saved; every amount with its currency; security headers and a required secret key; Alembic database migrations; optional S3-compatible file storage.</w:t>
-            </w:r>
-          </w:p>
-        </w:tc>
-        <w:tc>
-          <w:tcPr>
-            <w:tcW w:w="1200" w:type="dxa"/>
-            <w:tcBorders>
-              <w:top w:val="single" w:sz="4" w:space="0" w:color="E2E8F0"/>
-              <w:left w:val="nil"/>
-              <w:bottom w:val="single" w:sz="4" w:space="0" w:color="E2E8F0"/>
-              <w:right w:val="nil"/>
-            </w:tcBorders>
-            <w:shd w:val="clear" w:color="auto" w:fill="FFFFFF"/>
-            <w:tcMar>
-              <w:top w:w="90" w:type="dxa"/>
-              <w:left w:w="160" w:type="dxa"/>
-              <w:bottom w:w="90" w:type="dxa"/>
-              <w:right w:w="160" w:type="dxa"/>
-            </w:tcMar>
-            <w:vAlign w:val="center"/>
-          </w:tcPr>
-          <w:p>
-            <w:r>
-              <w:rPr>
-                <w:color w:val="1E293B"/>
-                <w:sz w:val="18"/>
-                <w:szCs w:val="18"/>
-              </w:rPr>
-              <w:t>54</w:t>
-            </w:r>
-          </w:p>
-        </w:tc>
-      </w:tr>
-    </w:tbl>
-    <w:p>
-      <w:pPr>
-        <w:spacing w:after="120"/>
-      </w:pPr>
-    </w:p>
-    <w:p>
-      <w:pPr>
-        <w:pStyle w:val="Heading2"/>
-        <w:keepNext/>
-      </w:pPr>
-      <w:bookmarkStart w:id="952" w:name="_Toc0000052"/>
-      <w:r>
-        <w:t xml:space="preserve">10.2 Current Figures</w:t>
-      </w:r>
-      <w:bookmarkEnd w:id="952"/>
-    </w:p>
-    <w:tbl>
-      <w:tblPr>
-        <w:tblW w:w="9360" w:type="dxa"/>
-        <w:tblBorders>
-          <w:top w:val="single" w:sz="4" w:space="0" w:color="CBD5E1"/>
-          <w:left w:val="nil"/>
-          <w:bottom w:val="single" w:sz="4" w:space="0" w:color="CBD5E1"/>
-          <w:right w:val="nil"/>
-          <w:insideH w:val="single" w:sz="4" w:space="0" w:color="CBD5E1"/>
-          <w:insideV w:val="nil"/>
-        </w:tblBorders>
-        <w:tblCellMar>
-          <w:left w:w="10" w:type="dxa"/>
-          <w:right w:w="10" w:type="dxa"/>
-        </w:tblCellMar>
-      </w:tblPr>
-      <w:tblGrid>
-        <w:gridCol w:w="3960"/>
-        <w:gridCol w:w="2700"/>
-        <w:gridCol w:w="2700"/>
-      </w:tblGrid>
-      <w:tr>
-        <w:trPr>
-          <w:tblHeader/>
-        </w:trPr>
-        <w:tc>
-          <w:tcPr>
-            <w:tcW w:w="3960" w:type="dxa"/>
-            <w:tcBorders>
-              <w:top w:val="single" w:sz="4" w:space="0" w:color="E2E8F0"/>
-              <w:left w:val="nil"/>
-              <w:bottom w:val="single" w:sz="4" w:space="0" w:color="E2E8F0"/>
-              <w:right w:val="nil"/>
-            </w:tcBorders>
-            <w:shd w:val="clear" w:color="auto" w:fill="0F172A"/>
-            <w:tcMar>
-              <w:top w:w="90" w:type="dxa"/>
-              <w:left w:w="160" w:type="dxa"/>
-              <w:bottom w:w="90" w:type="dxa"/>
-              <w:right w:w="160" w:type="dxa"/>
-            </w:tcMar>
-            <w:vAlign w:val="center"/>
-          </w:tcPr>
-          <w:p>
-            <w:r>
-              <w:rPr>
-                <w:b/>
-                <w:bCs/>
-                <w:color w:val="FFFFFF"/>
-                <w:sz w:val="18"/>
-                <w:szCs w:val="18"/>
-              </w:rPr>
-              <w:t xml:space="preserve">Figure</w:t>
-            </w:r>
-          </w:p>
-        </w:tc>
-        <w:tc>
-          <w:tcPr>
-            <w:tcW w:w="2700" w:type="dxa"/>
-            <w:tcBorders>
-              <w:top w:val="single" w:sz="4" w:space="0" w:color="E2E8F0"/>
-              <w:left w:val="nil"/>
-              <w:bottom w:val="single" w:sz="4" w:space="0" w:color="E2E8F0"/>
-              <w:right w:val="nil"/>
-            </w:tcBorders>
-            <w:shd w:val="clear" w:color="auto" w:fill="0F172A"/>
-            <w:tcMar>
-              <w:top w:w="90" w:type="dxa"/>
-              <w:left w:w="160" w:type="dxa"/>
-              <w:bottom w:w="90" w:type="dxa"/>
-              <w:right w:w="160" w:type="dxa"/>
-            </w:tcMar>
-            <w:vAlign w:val="center"/>
-          </w:tcPr>
-          <w:p>
-            <w:r>
-              <w:rPr>
-                <w:b/>
-                <w:bCs/>
-                <w:color w:val="FFFFFF"/>
-                <w:sz w:val="18"/>
-                <w:szCs w:val="18"/>
-              </w:rPr>
-              <w:t xml:space="preserve">At Deliverable 3</w:t>
-            </w:r>
-          </w:p>
-        </w:tc>
-        <w:tc>
-          <w:tcPr>
-            <w:tcW w:w="2700" w:type="dxa"/>
-            <w:tcBorders>
-              <w:top w:val="single" w:sz="4" w:space="0" w:color="E2E8F0"/>
-              <w:left w:val="nil"/>
-              <w:bottom w:val="single" w:sz="4" w:space="0" w:color="E2E8F0"/>
-              <w:right w:val="nil"/>
-            </w:tcBorders>
-            <w:shd w:val="clear" w:color="auto" w:fill="0F172A"/>
-            <w:tcMar>
-              <w:top w:w="90" w:type="dxa"/>
-              <w:left w:w="160" w:type="dxa"/>
-              <w:bottom w:w="90" w:type="dxa"/>
-              <w:right w:w="160" w:type="dxa"/>
-            </w:tcMar>
-            <w:vAlign w:val="center"/>
-          </w:tcPr>
-          <w:p>
-            <w:r>
-              <w:rPr>
-                <w:b/>
-                <w:bCs/>
-                <w:color w:val="FFFFFF"/>
-                <w:sz w:val="18"/>
-                <w:szCs w:val="18"/>
-              </w:rPr>
-              <w:t>Now (October 2026)</w:t>
-            </w:r>
-          </w:p>
-        </w:tc>
-      </w:tr>
-      <w:tr>
-        <w:tc>
-          <w:tcPr>
-            <w:tcW w:w="3960" w:type="dxa"/>
-            <w:tcBorders>
-              <w:top w:val="single" w:sz="4" w:space="0" w:color="E2E8F0"/>
-              <w:left w:val="nil"/>
-              <w:bottom w:val="single" w:sz="4" w:space="0" w:color="E2E8F0"/>
-              <w:right w:val="nil"/>
-            </w:tcBorders>
-            <w:shd w:val="clear" w:color="auto" w:fill="FFFFFF"/>
-            <w:tcMar>
-              <w:top w:w="90" w:type="dxa"/>
-              <w:left w:w="160" w:type="dxa"/>
-              <w:bottom w:w="90" w:type="dxa"/>
-              <w:right w:w="160" w:type="dxa"/>
-            </w:tcMar>
-            <w:vAlign w:val="center"/>
-          </w:tcPr>
-          <w:p>
-            <w:r>
-              <w:rPr>
-                <w:color w:val="1E293B"/>
-                <w:sz w:val="18"/>
-                <w:szCs w:val="18"/>
-              </w:rPr>
-              <w:t xml:space="preserve">Database tables</w:t>
-            </w:r>
-          </w:p>
-        </w:tc>
-        <w:tc>
-          <w:tcPr>
-            <w:tcW w:w="2700" w:type="dxa"/>
-            <w:tcBorders>
-              <w:top w:val="single" w:sz="4" w:space="0" w:color="E2E8F0"/>
-              <w:left w:val="nil"/>
-              <w:bottom w:val="single" w:sz="4" w:space="0" w:color="E2E8F0"/>
-              <w:right w:val="nil"/>
-            </w:tcBorders>
-            <w:shd w:val="clear" w:color="auto" w:fill="FFFFFF"/>
-            <w:tcMar>
-              <w:top w:w="90" w:type="dxa"/>
-              <w:left w:w="160" w:type="dxa"/>
-              <w:bottom w:w="90" w:type="dxa"/>
-              <w:right w:w="160" w:type="dxa"/>
-            </w:tcMar>
-            <w:vAlign w:val="center"/>
-          </w:tcPr>
-          <w:p>
-            <w:r>
-              <w:rPr>
-                <w:color w:val="1E293B"/>
-                <w:sz w:val="18"/>
-                <w:szCs w:val="18"/>
-              </w:rPr>
-              <w:t>13</w:t>
-            </w:r>
-          </w:p>
-        </w:tc>
-        <w:tc>
-          <w:tcPr>
-            <w:tcW w:w="2700" w:type="dxa"/>
-            <w:tcBorders>
-              <w:top w:val="single" w:sz="4" w:space="0" w:color="E2E8F0"/>
-              <w:left w:val="nil"/>
-              <w:bottom w:val="single" w:sz="4" w:space="0" w:color="E2E8F0"/>
-              <w:right w:val="nil"/>
-            </w:tcBorders>
-            <w:shd w:val="clear" w:color="auto" w:fill="FFFFFF"/>
-            <w:tcMar>
-              <w:top w:w="90" w:type="dxa"/>
-              <w:left w:w="160" w:type="dxa"/>
-              <w:bottom w:w="90" w:type="dxa"/>
-              <w:right w:w="160" w:type="dxa"/>
-            </w:tcMar>
-            <w:vAlign w:val="center"/>
-          </w:tcPr>
-          <w:p>
-            <w:r>
-              <w:rPr>
-                <w:color w:val="1E293B"/>
-                <w:sz w:val="18"/>
-                <w:szCs w:val="18"/>
-              </w:rPr>
-              <w:t xml:space="preserve">18</w:t>
-            </w:r>
-          </w:p>
-        </w:tc>
-      </w:tr>
-      <w:tr>
-        <w:tc>
-          <w:tcPr>
-            <w:tcW w:w="3960" w:type="dxa"/>
-            <w:tcBorders>
-              <w:top w:val="single" w:sz="4" w:space="0" w:color="E2E8F0"/>
-              <w:left w:val="nil"/>
-              <w:bottom w:val="single" w:sz="4" w:space="0" w:color="E2E8F0"/>
-              <w:right w:val="nil"/>
-            </w:tcBorders>
-            <w:shd w:val="clear" w:color="auto" w:fill="F8FAFC"/>
-            <w:tcMar>
-              <w:top w:w="90" w:type="dxa"/>
-              <w:left w:w="160" w:type="dxa"/>
-              <w:bottom w:w="90" w:type="dxa"/>
-              <w:right w:w="160" w:type="dxa"/>
-            </w:tcMar>
-            <w:vAlign w:val="center"/>
-          </w:tcPr>
-          <w:p>
-            <w:r>
-              <w:rPr>
-                <w:color w:val="1E293B"/>
-                <w:sz w:val="18"/>
-                <w:szCs w:val="18"/>
-              </w:rPr>
-              <w:t xml:space="preserve">HTML templates</w:t>
-            </w:r>
-          </w:p>
-        </w:tc>
-        <w:tc>
-          <w:tcPr>
-            <w:tcW w:w="2700" w:type="dxa"/>
-            <w:tcBorders>
-              <w:top w:val="single" w:sz="4" w:space="0" w:color="E2E8F0"/>
-              <w:left w:val="nil"/>
-              <w:bottom w:val="single" w:sz="4" w:space="0" w:color="E2E8F0"/>
-              <w:right w:val="nil"/>
-            </w:tcBorders>
-            <w:shd w:val="clear" w:color="auto" w:fill="F8FAFC"/>
-            <w:tcMar>
-              <w:top w:w="90" w:type="dxa"/>
-              <w:left w:w="160" w:type="dxa"/>
-              <w:bottom w:w="90" w:type="dxa"/>
-              <w:right w:w="160" w:type="dxa"/>
-            </w:tcMar>
-            <w:vAlign w:val="center"/>
-          </w:tcPr>
-          <w:p>
-            <w:r>
-              <w:rPr>
-                <w:color w:val="1E293B"/>
-                <w:sz w:val="18"/>
-                <w:szCs w:val="18"/>
-              </w:rPr>
-              <w:t>31</w:t>
-            </w:r>
-          </w:p>
-        </w:tc>
-        <w:tc>
-          <w:tcPr>
-            <w:tcW w:w="2700" w:type="dxa"/>
-            <w:tcBorders>
-              <w:top w:val="single" w:sz="4" w:space="0" w:color="E2E8F0"/>
-              <w:left w:val="nil"/>
-              <w:bottom w:val="single" w:sz="4" w:space="0" w:color="E2E8F0"/>
-              <w:right w:val="nil"/>
-            </w:tcBorders>
-            <w:shd w:val="clear" w:color="auto" w:fill="F8FAFC"/>
-            <w:tcMar>
-              <w:top w:w="90" w:type="dxa"/>
-              <w:left w:w="160" w:type="dxa"/>
-              <w:bottom w:w="90" w:type="dxa"/>
-              <w:right w:w="160" w:type="dxa"/>
-            </w:tcMar>
-            <w:vAlign w:val="center"/>
-          </w:tcPr>
-          <w:p>
-            <w:r>
-              <w:rPr>
-                <w:color w:val="1E293B"/>
-                <w:sz w:val="18"/>
-                <w:szCs w:val="18"/>
-              </w:rPr>
-              <w:t>40</w:t>
-            </w:r>
-          </w:p>
-        </w:tc>
-      </w:tr>
-      <w:tr>
-        <w:tc>
-          <w:tcPr>
-            <w:tcW w:w="3960" w:type="dxa"/>
-            <w:tcBorders>
-              <w:top w:val="single" w:sz="4" w:space="0" w:color="E2E8F0"/>
-              <w:left w:val="nil"/>
-              <w:bottom w:val="single" w:sz="4" w:space="0" w:color="E2E8F0"/>
-              <w:right w:val="nil"/>
-            </w:tcBorders>
-            <w:shd w:val="clear" w:color="auto" w:fill="FFFFFF"/>
-            <w:tcMar>
-              <w:top w:w="90" w:type="dxa"/>
-              <w:left w:w="160" w:type="dxa"/>
-              <w:bottom w:w="90" w:type="dxa"/>
-              <w:right w:w="160" w:type="dxa"/>
-            </w:tcMar>
-            <w:vAlign w:val="center"/>
-          </w:tcPr>
-          <w:p>
-            <w:r>
-              <w:rPr>
-                <w:color w:val="1E293B"/>
-                <w:sz w:val="18"/>
-                <w:szCs w:val="18"/>
-              </w:rPr>
-              <w:t xml:space="preserve">Background scheduler jobs</w:t>
-            </w:r>
-          </w:p>
-        </w:tc>
-        <w:tc>
-          <w:tcPr>
-            <w:tcW w:w="2700" w:type="dxa"/>
-            <w:tcBorders>
-              <w:top w:val="single" w:sz="4" w:space="0" w:color="E2E8F0"/>
-              <w:left w:val="nil"/>
-              <w:bottom w:val="single" w:sz="4" w:space="0" w:color="E2E8F0"/>
-              <w:right w:val="nil"/>
-            </w:tcBorders>
-            <w:shd w:val="clear" w:color="auto" w:fill="FFFFFF"/>
-            <w:tcMar>
-              <w:top w:w="90" w:type="dxa"/>
-              <w:left w:w="160" w:type="dxa"/>
-              <w:bottom w:w="90" w:type="dxa"/>
-              <w:right w:w="160" w:type="dxa"/>
-            </w:tcMar>
-            <w:vAlign w:val="center"/>
-          </w:tcPr>
-          <w:p>
-            <w:r>
-              <w:rPr>
-                <w:color w:val="1E293B"/>
-                <w:sz w:val="18"/>
-                <w:szCs w:val="18"/>
-              </w:rPr>
-              <w:t>4</w:t>
-            </w:r>
-          </w:p>
-        </w:tc>
-        <w:tc>
-          <w:tcPr>
-            <w:tcW w:w="2700" w:type="dxa"/>
-            <w:tcBorders>
-              <w:top w:val="single" w:sz="4" w:space="0" w:color="E2E8F0"/>
-              <w:left w:val="nil"/>
-              <w:bottom w:val="single" w:sz="4" w:space="0" w:color="E2E8F0"/>
-              <w:right w:val="nil"/>
-            </w:tcBorders>
-            <w:shd w:val="clear" w:color="auto" w:fill="FFFFFF"/>
-            <w:tcMar>
-              <w:top w:w="90" w:type="dxa"/>
-              <w:left w:w="160" w:type="dxa"/>
-              <w:bottom w:w="90" w:type="dxa"/>
-              <w:right w:w="160" w:type="dxa"/>
-            </w:tcMar>
-            <w:vAlign w:val="center"/>
-          </w:tcPr>
-          <w:p>
-            <w:r>
-              <w:rPr>
-                <w:color w:val="1E293B"/>
-                <w:sz w:val="18"/>
-                <w:szCs w:val="18"/>
-              </w:rPr>
-              <w:t xml:space="preserve">5</w:t>
-            </w:r>
-          </w:p>
-        </w:tc>
-      </w:tr>
-      <w:tr>
-        <w:tc>
-          <w:tcPr>
-            <w:tcW w:w="3960" w:type="dxa"/>
-            <w:tcBorders>
-              <w:top w:val="single" w:sz="4" w:space="0" w:color="E2E8F0"/>
-              <w:left w:val="nil"/>
-              <w:bottom w:val="single" w:sz="4" w:space="0" w:color="E2E8F0"/>
-              <w:right w:val="nil"/>
-            </w:tcBorders>
-            <w:shd w:val="clear" w:color="auto" w:fill="F8FAFC"/>
-            <w:tcMar>
-              <w:top w:w="90" w:type="dxa"/>
-              <w:left w:w="160" w:type="dxa"/>
-              <w:bottom w:w="90" w:type="dxa"/>
-              <w:right w:w="160" w:type="dxa"/>
-            </w:tcMar>
-            <w:vAlign w:val="center"/>
-          </w:tcPr>
-          <w:p>
-            <w:r>
-              <w:rPr>
-                <w:color w:val="1E293B"/>
-                <w:sz w:val="18"/>
-                <w:szCs w:val="18"/>
-              </w:rPr>
-              <w:t xml:space="preserve">Automated tests</w:t>
-            </w:r>
-          </w:p>
-        </w:tc>
-        <w:tc>
-          <w:tcPr>
-            <w:tcW w:w="2700" w:type="dxa"/>
-            <w:tcBorders>
-              <w:top w:val="single" w:sz="4" w:space="0" w:color="E2E8F0"/>
-              <w:left w:val="nil"/>
-              <w:bottom w:val="single" w:sz="4" w:space="0" w:color="E2E8F0"/>
-              <w:right w:val="nil"/>
-            </w:tcBorders>
-            <w:shd w:val="clear" w:color="auto" w:fill="F8FAFC"/>
-            <w:tcMar>
-              <w:top w:w="90" w:type="dxa"/>
-              <w:left w:w="160" w:type="dxa"/>
-              <w:bottom w:w="90" w:type="dxa"/>
-              <w:right w:w="160" w:type="dxa"/>
-            </w:tcMar>
-            <w:vAlign w:val="center"/>
-          </w:tcPr>
-          <w:p>
-            <w:r>
-              <w:rPr>
-                <w:color w:val="1E293B"/>
-                <w:sz w:val="18"/>
-                <w:szCs w:val="18"/>
-              </w:rPr>
-              <w:t>93</w:t>
-            </w:r>
-          </w:p>
-        </w:tc>
-        <w:tc>
-          <w:tcPr>
-            <w:tcW w:w="2700" w:type="dxa"/>
-            <w:tcBorders>
-              <w:top w:val="single" w:sz="4" w:space="0" w:color="E2E8F0"/>
-              <w:left w:val="nil"/>
-              <w:bottom w:val="single" w:sz="4" w:space="0" w:color="E2E8F0"/>
-              <w:right w:val="nil"/>
-            </w:tcBorders>
-            <w:shd w:val="clear" w:color="auto" w:fill="F8FAFC"/>
-            <w:tcMar>
-              <w:top w:w="90" w:type="dxa"/>
-              <w:left w:w="160" w:type="dxa"/>
-              <w:bottom w:w="90" w:type="dxa"/>
-              <w:right w:w="160" w:type="dxa"/>
-            </w:tcMar>
-            <w:vAlign w:val="center"/>
-          </w:tcPr>
-          <w:p>
-            <w:r>
-              <w:rPr>
-                <w:color w:val="1E293B"/>
-                <w:sz w:val="18"/>
-                <w:szCs w:val="18"/>
-              </w:rPr>
-              <w:t>298</w:t>
-            </w:r>
-          </w:p>
-        </w:tc>
-      </w:tr>
-      <w:tr>
-        <w:tc>
-          <w:tcPr>
-            <w:tcW w:w="3960" w:type="dxa"/>
-            <w:tcBorders>
-              <w:top w:val="single" w:sz="4" w:space="0" w:color="E2E8F0"/>
-              <w:left w:val="nil"/>
-              <w:bottom w:val="single" w:sz="4" w:space="0" w:color="E2E8F0"/>
-              <w:right w:val="nil"/>
-            </w:tcBorders>
-            <w:shd w:val="clear" w:color="auto" w:fill="FFFFFF"/>
-            <w:tcMar>
-              <w:top w:w="90" w:type="dxa"/>
-              <w:left w:w="160" w:type="dxa"/>
-              <w:bottom w:w="90" w:type="dxa"/>
-              <w:right w:w="160" w:type="dxa"/>
-            </w:tcMar>
-            <w:vAlign w:val="center"/>
-          </w:tcPr>
-          <w:p>
-            <w:r>
-              <w:rPr>
-                <w:color w:val="1E293B"/>
-                <w:sz w:val="18"/>
-                <w:szCs w:val="18"/>
-              </w:rPr>
-              <w:t xml:space="preserve">Statement coverage</w:t>
-            </w:r>
-          </w:p>
-        </w:tc>
-        <w:tc>
-          <w:tcPr>
-            <w:tcW w:w="2700" w:type="dxa"/>
-            <w:tcBorders>
-              <w:top w:val="single" w:sz="4" w:space="0" w:color="E2E8F0"/>
-              <w:left w:val="nil"/>
-              <w:bottom w:val="single" w:sz="4" w:space="0" w:color="E2E8F0"/>
-              <w:right w:val="nil"/>
-            </w:tcBorders>
-            <w:shd w:val="clear" w:color="auto" w:fill="FFFFFF"/>
-            <w:tcMar>
-              <w:top w:w="90" w:type="dxa"/>
-              <w:left w:w="160" w:type="dxa"/>
-              <w:bottom w:w="90" w:type="dxa"/>
-              <w:right w:w="160" w:type="dxa"/>
-            </w:tcMar>
-            <w:vAlign w:val="center"/>
-          </w:tcPr>
-          <w:p>
-            <w:r>
-              <w:rPr>
-                <w:color w:val="1E293B"/>
-                <w:sz w:val="18"/>
-                <w:szCs w:val="18"/>
-              </w:rPr>
-              <w:t>77%</w:t>
-            </w:r>
-          </w:p>
-        </w:tc>
-        <w:tc>
-          <w:tcPr>
-            <w:tcW w:w="2700" w:type="dxa"/>
-            <w:tcBorders>
-              <w:top w:val="single" w:sz="4" w:space="0" w:color="E2E8F0"/>
-              <w:left w:val="nil"/>
-              <w:bottom w:val="single" w:sz="4" w:space="0" w:color="E2E8F0"/>
-              <w:right w:val="nil"/>
-            </w:tcBorders>
-            <w:shd w:val="clear" w:color="auto" w:fill="FFFFFF"/>
-            <w:tcMar>
-              <w:top w:w="90" w:type="dxa"/>
-              <w:left w:w="160" w:type="dxa"/>
-              <w:bottom w:w="90" w:type="dxa"/>
-              <w:right w:w="160" w:type="dxa"/>
-            </w:tcMar>
-            <w:vAlign w:val="center"/>
-          </w:tcPr>
-          <w:p>
-            <w:r>
-              <w:rPr>
-                <w:color w:val="1E293B"/>
-                <w:sz w:val="18"/>
-                <w:szCs w:val="18"/>
-              </w:rPr>
-              <w:t>85%</w:t>
-            </w:r>
-          </w:p>
-        </w:tc>
-      </w:tr>
-      <w:tr>
-        <w:tc>
-          <w:tcPr>
-            <w:tcW w:w="3960" w:type="dxa"/>
-            <w:tcBorders>
-              <w:top w:val="single" w:sz="4" w:space="0" w:color="E2E8F0"/>
-              <w:left w:val="nil"/>
-              <w:bottom w:val="single" w:sz="4" w:space="0" w:color="E2E8F0"/>
-              <w:right w:val="nil"/>
-            </w:tcBorders>
-            <w:shd w:val="clear" w:color="auto" w:fill="F8FAFC"/>
-            <w:tcMar>
-              <w:top w:w="90" w:type="dxa"/>
-              <w:left w:w="160" w:type="dxa"/>
-              <w:bottom w:w="90" w:type="dxa"/>
-              <w:right w:w="160" w:type="dxa"/>
-            </w:tcMar>
-            <w:vAlign w:val="center"/>
-          </w:tcPr>
-          <w:p>
-            <w:r>
-              <w:rPr>
-                <w:color w:val="1E293B"/>
-                <w:sz w:val="18"/>
-                <w:szCs w:val="18"/>
-              </w:rPr>
-              <w:t xml:space="preserve">Interface languages</w:t>
-            </w:r>
-          </w:p>
-        </w:tc>
-        <w:tc>
-          <w:tcPr>
-            <w:tcW w:w="2700" w:type="dxa"/>
-            <w:tcBorders>
-              <w:top w:val="single" w:sz="4" w:space="0" w:color="E2E8F0"/>
-              <w:left w:val="nil"/>
-              <w:bottom w:val="single" w:sz="4" w:space="0" w:color="E2E8F0"/>
-              <w:right w:val="nil"/>
-            </w:tcBorders>
-            <w:shd w:val="clear" w:color="auto" w:fill="F8FAFC"/>
-            <w:tcMar>
-              <w:top w:w="90" w:type="dxa"/>
-              <w:left w:w="160" w:type="dxa"/>
-              <w:bottom w:w="90" w:type="dxa"/>
-              <w:right w:w="160" w:type="dxa"/>
-            </w:tcMar>
-            <w:vAlign w:val="center"/>
-          </w:tcPr>
-          <w:p>
-            <w:r>
-              <w:rPr>
-                <w:color w:val="1E293B"/>
-                <w:sz w:val="18"/>
-                <w:szCs w:val="18"/>
-              </w:rPr>
-              <w:t xml:space="preserve">1 (English)</w:t>
-            </w:r>
-          </w:p>
-        </w:tc>
-        <w:tc>
-          <w:tcPr>
-            <w:tcW w:w="2700" w:type="dxa"/>
-            <w:tcBorders>
-              <w:top w:val="single" w:sz="4" w:space="0" w:color="E2E8F0"/>
-              <w:left w:val="nil"/>
-              <w:bottom w:val="single" w:sz="4" w:space="0" w:color="E2E8F0"/>
-              <w:right w:val="nil"/>
-            </w:tcBorders>
-            <w:shd w:val="clear" w:color="auto" w:fill="F8FAFC"/>
-            <w:tcMar>
-              <w:top w:w="90" w:type="dxa"/>
-              <w:left w:w="160" w:type="dxa"/>
-              <w:bottom w:w="90" w:type="dxa"/>
-              <w:right w:w="160" w:type="dxa"/>
-            </w:tcMar>
-            <w:vAlign w:val="center"/>
-          </w:tcPr>
-          <w:p>
-            <w:r>
-              <w:rPr>
-                <w:color w:val="1E293B"/>
-                <w:sz w:val="18"/>
-                <w:szCs w:val="18"/>
-              </w:rPr>
-              <w:t xml:space="preserve">3 (English, Shona, Arabic)</w:t>
-            </w:r>
-          </w:p>
-        </w:tc>
-      </w:tr>
-    </w:tbl>
-    <w:p>
-      <w:pPr>
-        <w:spacing w:after="120"/>
-      </w:pPr>
-    </w:p>
-    <w:p>
-      <w:pPr>
-        <w:spacing w:after="100"/>
-      </w:pPr>
-      <w:r>
-        <w:rPr>
-          <w:color w:val="1E293B"/>
-        </w:rPr>
-        <w:t>All 298 tests pass with no failures, and the suite still runs entirely offline, with no paid external account needed.</w:t>
-      </w:r>
-    </w:p>
-    <w:p>
-      <w:pPr>
-        <w:pStyle w:val="Heading2"/>
-        <w:keepNext/>
-      </w:pPr>
-      <w:bookmarkStart w:id="953" w:name="_Toc0000053"/>
-      <w:r>
-        <w:t xml:space="preserve">10.3 Language Support and the SRS</w:t>
-      </w:r>
-      <w:bookmarkEnd w:id="953"/>
-    </w:p>
-    <w:p>
-      <w:pPr>
-        <w:spacing w:after="100"/>
-      </w:pPr>
-      <w:r>
-        <w:rPr>
-          <w:color w:val="1E293B"/>
-        </w:rPr>
-        <w:t xml:space="preserve">The SRS described multi-language support as Arabic and English. Both are now implemented, together with Shona. Shona, the most widely spoken language in Harare, serves the landlords, managers and tenants the system was built for; Arabic, the second language the SRS named, serves Arabic-speaking residents and property owners in Zimbabwe. Each language is only another phrase table, so a further language, such as Ndebele, can be added the same way.</w:t>
-      </w:r>
-    </w:p>
-    <w:p>
-      <w:pPr>
-        <w:numPr>
-          <w:ilvl w:val="0"/>
-          <w:numId w:val="1"/>
-        </w:numPr>
-        <w:spacing w:after="60"/>
-      </w:pPr>
-      <w:r>
-        <w:rPr>
-          <w:b/>
-          <w:bCs/>
-          <w:color w:val="1E293B"/>
-        </w:rPr>
-        <w:t xml:space="preserve">How it works: </w:t>
-      </w:r>
-      <w:r>
-        <w:rPr>
-          <w:color w:val="1E293B"/>
-        </w:rPr>
-        <w:t xml:space="preserve"> Templates wrap interface text in _("…"); backend/i18n.py looks each phrase up in the table for the chosen language — the Arabic table covers all 613 phrases the app shows or sends, the Shona table the 98 on the main screens — and falls back to English for anything not yet translated, so the app works at every stage of translation.</w:t>
-      </w:r>
-    </w:p>
-    <w:p>
-      <w:pPr>
-        <w:numPr>
-          <w:ilvl w:val="0"/>
-          <w:numId w:val="1"/>
-        </w:numPr>
-        <w:spacing w:after="60"/>
-      </w:pPr>
-      <w:r>
-        <w:rPr>
-          <w:b/>
-          <w:bCs/>
-          <w:color w:val="1E293B"/>
-        </w:rPr>
-        <w:t xml:space="preserve">Right-to-left layout: </w:t>
-      </w:r>
-      <w:r>
-        <w:rPr>
-          <w:color w:val="1E293B"/>
-        </w:rPr>
-        <w:t xml:space="preserve">Arabic is written from right to left, so an Arabic page is marked dir="rtl" and the browser mirrors the layout: the navigation starts from the right and table columns read from right to left (see the Arabic dashboard in Section 10.4), and on the login page the RentalPro name and the language menu swap corners. The stylesheet aligns text to the start of the line rather than to a fixed left or right, so one stylesheet serves both directions. English and Shona stay left to right.</w:t>
-      </w:r>
-    </w:p>
-    <w:p>
-      <w:pPr>
-        <w:numPr>
-          <w:ilvl w:val="0"/>
-          <w:numId w:val="1"/>
-        </w:numPr>
-        <w:spacing w:after="60"/>
-      </w:pPr>
-      <w:r>
-        <w:rPr>
-          <w:b/>
-          <w:bCs/>
-          <w:color w:val="1E293B"/>
-        </w:rPr>
-        <w:t xml:space="preserve">Choosing a language: </w:t>
-      </w:r>
-      <w:r>
-        <w:rPr>
-          <w:color w:val="1E293B"/>
-        </w:rPr>
-        <w:t xml:space="preserve"> A language button in the top bar and on the login page shows the current language; clicking its arrow opens a vertical list of English, ChiShona and Arabic, each written in its own language. The list closes on a click elsewhere or the Escape key. The choice survives logging in and out and is saved to the user's account, so it follows them to any browser and their emails and SMS are written in it; the menu’s return address is checked so it cannot redirect off-site.</w:t>
-      </w:r>
-    </w:p>
-    <w:p>
-      <w:pPr>
-        <w:numPr>
-          <w:ilvl w:val="0"/>
-          <w:numId w:val="1"/>
-        </w:numPr>
-        <w:spacing w:after="60"/>
-      </w:pPr>
-      <w:r>
-        <w:rPr>
-          <w:b/>
-          <w:bCs/>
-          <w:color w:val="1E293B"/>
-        </w:rPr>
-        <w:t xml:space="preserve">Translated: </w:t>
-      </w:r>
-      <w:r>
-        <w:rPr>
-          <w:color w:val="1E293B"/>
-        </w:rPr>
-        <w:t>Arabic covers every page, form option and message, every email and SMS, the PDFs (with joined, right-to-left letters) and the Excel and CSV exports; a test fails if any text the app shows or sends has no Arabic. Shona covers navigation for every role, login and password reset, the dashboards, the main list pages, the tenant portal and status badges; other Shona text falls back to English.</w:t>
-      </w:r>
-    </w:p>
-    <w:p>
-      <w:pPr>
-        <w:numPr>
-          <w:ilvl w:val="0"/>
-          <w:numId w:val="1"/>
-        </w:numPr>
-        <w:spacing w:after="60"/>
-      </w:pPr>
-      <w:r>
-        <w:rPr>
-          <w:b/>
-          <w:bCs/>
-          <w:color w:val="1E293B"/>
-        </w:rPr>
-        <w:t xml:space="preserve">Never translated: </w:t>
-      </w:r>
-      <w:r>
-        <w:rPr>
-          <w:color w:val="1E293B"/>
-        </w:rPr>
-        <w:t xml:space="preserve">Property names, addresses, suburbs, cities and people’s names are data, not interface text, and read the same in every language; a test fails if a Harare place name is altered in Shona or Arabic, or given an entry in either phrase table.</w:t>
-      </w:r>
-    </w:p>
-    <w:p>
-      <w:pPr>
-        <w:numPr>
-          <w:ilvl w:val="0"/>
-          <w:numId w:val="1"/>
-        </w:numPr>
-        <w:spacing w:after="60"/>
-      </w:pPr>
-      <w:r>
-        <w:rPr>
-          <w:b/>
-          <w:bCs/>
-          <w:color w:val="1E293B"/>
-        </w:rPr>
-        <w:t xml:space="preserve">Tests: </w:t>
-      </w:r>
-      <w:r>
-        <w:rPr>
-          <w:color w:val="1E293B"/>
-        </w:rPr>
-        <w:t>Fourteen tests cover the languages: switching to Shona and to Arabic, the right-to-left direction for Arabic only, the choice surviving login, the tenant portal in Shona and in Arabic, the language menu, unknown language codes, off-site redirects, placeholders kept in every translation, Arabic covering every Shona phrase, and place names. Later tests check that every phrase the app shows or sends has Arabic, and that emails, SMS, PDFs, Excel and CSV follow the reader's language.</w:t>
-      </w:r>
-    </w:p>
-    <w:p>
-      <w:pPr>
-        <w:numPr>
-          <w:ilvl w:val="0"/>
-          <w:numId w:val="1"/>
-        </w:numPr>
-        <w:spacing w:after="60"/>
-      </w:pPr>
-      <w:r>
-        <w:rPr>
-          <w:b/>
-          <w:bCs/>
-          <w:color w:val="1E293B"/>
-        </w:rPr>
-        <w:t xml:space="preserve">Caveat: </w:t>
-      </w:r>
-      <w:r>
-        <w:rPr>
-          <w:color w:val="1E293B"/>
-        </w:rPr>
-        <w:t xml:space="preserve">The Shona and Arabic wording has not yet been reviewed by native speakers.</w:t>
-      </w:r>
-    </w:p>
-    <w:p>
-      <w:pPr>
-        <w:pStyle w:val="Heading2"/>
-        <w:keepNext/>
-      </w:pPr>
-      <w:bookmarkStart w:id="954" w:name="_Toc0000054"/>
-      <w:r>
-        <w:t xml:space="preserve">10.4 The Current Interface</w:t>
-      </w:r>
-      <w:bookmarkEnd w:id="954"/>
-    </w:p>
-    <w:p>
-      <w:pPr>
-        <w:keepNext/>
-        <w:spacing w:after="0" w:before="160"/>
-        <w:jc w:val="center"/>
-      </w:pPr>
-      <w:r>
-        <w:drawing>
-          <wp:inline distT="0" distB="0" distL="0" distR="0">
-            <wp:extent cx="5943600" cy="3714750"/>
-            <wp:effectExtent t="0" r="0" b="0" l="0"/>
-            <wp:docPr id="900" name="Picture 900" descr="RentalPro login page over a photograph of the Harare skyline, with the language menu opened"/>
-            <wp:cNvGraphicFramePr>
-              <a:graphicFrameLocks xmlns:a="http://schemas.openxmlformats.org/drawingml/2006/main" noChangeAspect="1"/>
-            </wp:cNvGraphicFramePr>
-            <a:graphic xmlns:a="http://schemas.openxmlformats.org/drawingml/2006/main">
-              <a:graphicData uri="http://schemas.openxmlformats.org/drawingml/2006/picture">
-                <pic:pic xmlns:pic="http://schemas.openxmlformats.org/drawingml/2006/picture">
-                  <pic:nvPicPr>
-                    <pic:cNvPr id="900" name="Picture 900" descr="RentalPro login page over a photograph of the Harare skyline, with the language menu opened"/>
-                    <pic:cNvPicPr>
-                      <a:picLocks noChangeAspect="1"/>
-                    </pic:cNvPicPr>
-                  </pic:nvPicPr>
-                  <pic:blipFill>
-                    <a:blip r:embed="rId12"/>
-                    <a:stretch>
-                      <a:fillRect/>
-                    </a:stretch>
-                  </pic:blipFill>
-                  <pic:spPr>
-                    <a:xfrm>
-                      <a:off x="0" y="0"/>
-                      <a:ext cx="5943600" cy="3714750"/>
-                    </a:xfrm>
-                    <a:prstGeom prst="rect">
-                      <a:avLst/>
-                    </a:prstGeom>
-                    <a:ln w="9525">
-                      <a:solidFill>
-                        <a:srgbClr val="CBD5E1"/>
-                      </a:solidFill>
-                    </a:ln>
-                  </pic:spPr>
-                </pic:pic>
-              </a:graphicData>
-            </a:graphic>
-          </wp:inline>
-        </w:drawing>
-      </w:r>
-    </w:p>
-    <w:p>
-      <w:pPr>
-        <w:spacing w:before="80" w:after="200"/>
-        <w:jc w:val="center"/>
-      </w:pPr>
-      <w:r>
-        <w:rPr>
-          <w:i/>
-          <w:color w:val="475569"/>
-          <w:sz w:val="18"/>
-          <w:szCs w:val="18"/>
-        </w:rPr>
-        <w:t xml:space="preserve">Figure: The login page — Harare skyline, translucent card and the language menu, opened</w:t>
-      </w:r>
-    </w:p>
-    <w:p>
-      <w:pPr>
-        <w:keepNext/>
-        <w:spacing w:after="0" w:before="160"/>
-        <w:jc w:val="center"/>
-      </w:pPr>
-      <w:r>
-        <w:drawing>
-          <wp:inline distT="0" distB="0" distL="0" distR="0">
-            <wp:extent cx="5943600" cy="3714750"/>
-            <wp:effectExtent t="0" r="0" b="0" l="0"/>
-            <wp:docPr id="901" name="Picture 901" descr="The portfolio dashboard shown in Shona"/>
-            <wp:cNvGraphicFramePr>
-              <a:graphicFrameLocks xmlns:a="http://schemas.openxmlformats.org/drawingml/2006/main" noChangeAspect="1"/>
-            </wp:cNvGraphicFramePr>
-            <a:graphic xmlns:a="http://schemas.openxmlformats.org/drawingml/2006/main">
-              <a:graphicData uri="http://schemas.openxmlformats.org/drawingml/2006/picture">
-                <pic:pic xmlns:pic="http://schemas.openxmlformats.org/drawingml/2006/picture">
-                  <pic:nvPicPr>
-                    <pic:cNvPr id="901" name="Picture 901" descr="The portfolio dashboard shown in Shona"/>
-                    <pic:cNvPicPr>
-                      <a:picLocks noChangeAspect="1"/>
-                    </pic:cNvPicPr>
-                  </pic:nvPicPr>
-                  <pic:blipFill>
-                    <a:blip r:embed="rId13"/>
-                    <a:stretch>
-                      <a:fillRect/>
-                    </a:stretch>
-                  </pic:blipFill>
-                  <pic:spPr>
-                    <a:xfrm>
-                      <a:off x="0" y="0"/>
-                      <a:ext cx="5943600" cy="3714750"/>
-                    </a:xfrm>
-                    <a:prstGeom prst="rect">
-                      <a:avLst/>
-                    </a:prstGeom>
-                    <a:ln w="9525">
-                      <a:solidFill>
-                        <a:srgbClr val="CBD5E1"/>
-                      </a:solidFill>
-                    </a:ln>
-                  </pic:spPr>
-                </pic:pic>
-              </a:graphicData>
-            </a:graphic>
-          </wp:inline>
-        </w:drawing>
-      </w:r>
-    </w:p>
-    <w:p>
-      <w:pPr>
-        <w:spacing w:before="80" w:after="200"/>
-        <w:jc w:val="center"/>
-      </w:pPr>
-      <w:r>
-        <w:rPr>
-          <w:i/>
-          <w:color w:val="475569"/>
-          <w:sz w:val="18"/>
-          <w:szCs w:val="18"/>
-        </w:rPr>
-        <w:t xml:space="preserve">Figure: The portfolio dashboard in Shona — names and places stay as entered</w:t>
-      </w:r>
-    </w:p>
-    <w:p>
-      <w:pPr>
-        <w:keepNext/>
-        <w:spacing w:after="0" w:before="160"/>
-        <w:jc w:val="center"/>
-      </w:pPr>
-      <w:r>
-        <w:drawing>
-          <wp:inline distT="0" distB="0" distL="0" distR="0">
-            <wp:extent cx="5943600" cy="3714750"/>
-            <wp:effectExtent t="0" r="0" b="0" l="0"/>
-            <wp:docPr id="902" name="Picture 902" descr="The portfolio dashboard shown in Arabic, right to left, with the language menu open"/>
-            <wp:cNvGraphicFramePr>
-              <a:graphicFrameLocks xmlns:a="http://schemas.openxmlformats.org/drawingml/2006/main" noChangeAspect="1"/>
-            </wp:cNvGraphicFramePr>
-            <a:graphic xmlns:a="http://schemas.openxmlformats.org/drawingml/2006/main">
-              <a:graphicData uri="http://schemas.openxmlformats.org/drawingml/2006/picture">
-                <pic:pic xmlns:pic="http://schemas.openxmlformats.org/drawingml/2006/picture">
-                  <pic:nvPicPr>
-                    <pic:cNvPr id="902" name="Picture 902" descr="The portfolio dashboard shown in Arabic, right to left, with the language menu open"/>
-                    <pic:cNvPicPr>
-                      <a:picLocks noChangeAspect="1"/>
-                    </pic:cNvPicPr>
-                  </pic:nvPicPr>
-                  <pic:blipFill>
-                    <a:blip r:embed="rId14"/>
-                    <a:stretch>
-                      <a:fillRect/>
-                    </a:stretch>
-                  </pic:blipFill>
-                  <pic:spPr>
-                    <a:xfrm>
-                      <a:off x="0" y="0"/>
-                      <a:ext cx="5943600" cy="3714750"/>
-                    </a:xfrm>
-                    <a:prstGeom prst="rect">
-                      <a:avLst/>
-                    </a:prstGeom>
-                    <a:ln w="9525">
-                      <a:solidFill>
-                        <a:srgbClr val="CBD5E1"/>
-                      </a:solidFill>
-                    </a:ln>
-                  </pic:spPr>
-                </pic:pic>
-              </a:graphicData>
-            </a:graphic>
-          </wp:inline>
-        </w:drawing>
-      </w:r>
-    </w:p>
-    <w:p>
-      <w:pPr>
-        <w:spacing w:before="80" w:after="200"/>
-        <w:jc w:val="center"/>
-      </w:pPr>
-      <w:r>
-        <w:rPr>
-          <w:i/>
-          <w:color w:val="475569"/>
-          <w:sz w:val="18"/>
-          <w:szCs w:val="18"/>
-        </w:rPr>
-        <w:t xml:space="preserve">Figure: The portfolio dashboard in Arabic — the layout reads right to left and the language menu is open</w:t>
-      </w:r>
-    </w:p>
-    <w:p>
-      <w:pPr>
-        <w:pStyle w:val="Heading2"/>
-        <w:keepNext/>
-      </w:pPr>
-      <w:bookmarkStart w:id="955" w:name="_Toc0000055"/>
-      <w:r>
-        <w:t xml:space="preserve">10.5 Updated Demo Accounts and Data</w:t>
-      </w:r>
-      <w:bookmarkEnd w:id="955"/>
-    </w:p>
-    <w:p>
-      <w:pPr>
-        <w:spacing w:after="100"/>
-      </w:pPr>
-      <w:r>
-        <w:rPr>
-          <w:color w:val="1E293B"/>
-        </w:rPr>
-        <w:t xml:space="preserve">All demo accounts use the password demo123. The seed data only loads into an empty database; delete rentalpro.db (or the Postgres volume) to reload it.</w:t>
-      </w:r>
-    </w:p>
-    <w:tbl>
-      <w:tblPr>
-        <w:tblW w:w="9360" w:type="dxa"/>
-        <w:tblBorders>
-          <w:top w:val="single" w:sz="4" w:space="0" w:color="CBD5E1"/>
-          <w:left w:val="nil"/>
-          <w:bottom w:val="single" w:sz="4" w:space="0" w:color="CBD5E1"/>
-          <w:right w:val="nil"/>
-          <w:insideH w:val="single" w:sz="4" w:space="0" w:color="CBD5E1"/>
-          <w:insideV w:val="nil"/>
-        </w:tblBorders>
-        <w:tblCellMar>
-          <w:left w:w="10" w:type="dxa"/>
-          <w:right w:w="10" w:type="dxa"/>
-        </w:tblCellMar>
-      </w:tblPr>
-      <w:tblGrid>
-        <w:gridCol w:w="3400"/>
-        <w:gridCol w:w="2600"/>
-        <w:gridCol w:w="3360"/>
-      </w:tblGrid>
-      <w:tr>
-        <w:trPr>
-          <w:tblHeader/>
-        </w:trPr>
-        <w:tc>
-          <w:tcPr>
-            <w:tcW w:w="3400" w:type="dxa"/>
-            <w:tcBorders>
-              <w:top w:val="single" w:sz="4" w:space="0" w:color="E2E8F0"/>
-              <w:left w:val="nil"/>
-              <w:bottom w:val="single" w:sz="4" w:space="0" w:color="E2E8F0"/>
-              <w:right w:val="nil"/>
-            </w:tcBorders>
-            <w:shd w:val="clear" w:color="auto" w:fill="0F172A"/>
-            <w:tcMar>
-              <w:top w:w="90" w:type="dxa"/>
-              <w:left w:w="160" w:type="dxa"/>
-              <w:bottom w:w="90" w:type="dxa"/>
-              <w:right w:w="160" w:type="dxa"/>
-            </w:tcMar>
-            <w:vAlign w:val="center"/>
-          </w:tcPr>
-          <w:p>
-            <w:r>
-              <w:rPr>
-                <w:b/>
-                <w:bCs/>
-                <w:color w:val="FFFFFF"/>
-                <w:sz w:val="18"/>
-                <w:szCs w:val="18"/>
-              </w:rPr>
-              <w:t xml:space="preserve">Email</w:t>
-            </w:r>
-          </w:p>
-        </w:tc>
-        <w:tc>
-          <w:tcPr>
-            <w:tcW w:w="2600" w:type="dxa"/>
-            <w:tcBorders>
-              <w:top w:val="single" w:sz="4" w:space="0" w:color="E2E8F0"/>
-              <w:left w:val="nil"/>
-              <w:bottom w:val="single" w:sz="4" w:space="0" w:color="E2E8F0"/>
-              <w:right w:val="nil"/>
-            </w:tcBorders>
-            <w:shd w:val="clear" w:color="auto" w:fill="0F172A"/>
-            <w:tcMar>
-              <w:top w:w="90" w:type="dxa"/>
-              <w:left w:w="160" w:type="dxa"/>
-              <w:bottom w:w="90" w:type="dxa"/>
-              <w:right w:w="160" w:type="dxa"/>
-            </w:tcMar>
-            <w:vAlign w:val="center"/>
-          </w:tcPr>
-          <w:p>
-            <w:r>
-              <w:rPr>
-                <w:b/>
-                <w:bCs/>
-                <w:color w:val="FFFFFF"/>
-                <w:sz w:val="18"/>
-                <w:szCs w:val="18"/>
-              </w:rPr>
-              <w:t xml:space="preserve">Name</w:t>
-            </w:r>
-          </w:p>
-        </w:tc>
-        <w:tc>
-          <w:tcPr>
-            <w:tcW w:w="3360" w:type="dxa"/>
-            <w:tcBorders>
-              <w:top w:val="single" w:sz="4" w:space="0" w:color="E2E8F0"/>
-              <w:left w:val="nil"/>
-              <w:bottom w:val="single" w:sz="4" w:space="0" w:color="E2E8F0"/>
-              <w:right w:val="nil"/>
-            </w:tcBorders>
-            <w:shd w:val="clear" w:color="auto" w:fill="0F172A"/>
-            <w:tcMar>
-              <w:top w:w="90" w:type="dxa"/>
-              <w:left w:w="160" w:type="dxa"/>
-              <w:bottom w:w="90" w:type="dxa"/>
-              <w:right w:w="160" w:type="dxa"/>
-            </w:tcMar>
-            <w:vAlign w:val="center"/>
-          </w:tcPr>
-          <w:p>
-            <w:r>
-              <w:rPr>
-                <w:b/>
-                <w:bCs/>
-                <w:color w:val="FFFFFF"/>
-                <w:sz w:val="18"/>
-                <w:szCs w:val="18"/>
-              </w:rPr>
-              <w:t xml:space="preserve">Role</w:t>
-            </w:r>
-          </w:p>
-        </w:tc>
-      </w:tr>
-      <w:tr>
-        <w:tc>
-          <w:tcPr>
-            <w:tcW w:w="3400" w:type="dxa"/>
-            <w:tcBorders>
-              <w:top w:val="single" w:sz="4" w:space="0" w:color="E2E8F0"/>
-              <w:left w:val="nil"/>
-              <w:bottom w:val="single" w:sz="4" w:space="0" w:color="E2E8F0"/>
-              <w:right w:val="nil"/>
-            </w:tcBorders>
-            <w:shd w:val="clear" w:color="auto" w:fill="FFFFFF"/>
-            <w:tcMar>
-              <w:top w:w="90" w:type="dxa"/>
-              <w:left w:w="160" w:type="dxa"/>
-              <w:bottom w:w="90" w:type="dxa"/>
-              <w:right w:w="160" w:type="dxa"/>
-            </w:tcMar>
-            <w:vAlign w:val="center"/>
-          </w:tcPr>
-          <w:p>
-            <w:r>
-              <w:rPr>
-                <w:color w:val="1E293B"/>
-                <w:sz w:val="18"/>
-                <w:szCs w:val="18"/>
-              </w:rPr>
-              <w:t xml:space="preserve">admin@rentalpro.com</w:t>
-            </w:r>
-          </w:p>
-        </w:tc>
-        <w:tc>
-          <w:tcPr>
-            <w:tcW w:w="2600" w:type="dxa"/>
-            <w:tcBorders>
-              <w:top w:val="single" w:sz="4" w:space="0" w:color="E2E8F0"/>
-              <w:left w:val="nil"/>
-              <w:bottom w:val="single" w:sz="4" w:space="0" w:color="E2E8F0"/>
-              <w:right w:val="nil"/>
-            </w:tcBorders>
-            <w:shd w:val="clear" w:color="auto" w:fill="FFFFFF"/>
-            <w:tcMar>
-              <w:top w:w="90" w:type="dxa"/>
-              <w:left w:w="160" w:type="dxa"/>
-              <w:bottom w:w="90" w:type="dxa"/>
-              <w:right w:w="160" w:type="dxa"/>
-            </w:tcMar>
-            <w:vAlign w:val="center"/>
-          </w:tcPr>
-          <w:p>
-            <w:r>
-              <w:rPr>
-                <w:color w:val="1E293B"/>
-                <w:sz w:val="18"/>
-                <w:szCs w:val="18"/>
-              </w:rPr>
-              <w:t xml:space="preserve">Abdur-Rahmaan Ali</w:t>
-            </w:r>
-          </w:p>
-        </w:tc>
-        <w:tc>
-          <w:tcPr>
-            <w:tcW w:w="3360" w:type="dxa"/>
-            <w:tcBorders>
-              <w:top w:val="single" w:sz="4" w:space="0" w:color="E2E8F0"/>
-              <w:left w:val="nil"/>
-              <w:bottom w:val="single" w:sz="4" w:space="0" w:color="E2E8F0"/>
-              <w:right w:val="nil"/>
-            </w:tcBorders>
-            <w:shd w:val="clear" w:color="auto" w:fill="FFFFFF"/>
-            <w:tcMar>
-              <w:top w:w="90" w:type="dxa"/>
-              <w:left w:w="160" w:type="dxa"/>
-              <w:bottom w:w="90" w:type="dxa"/>
-              <w:right w:w="160" w:type="dxa"/>
-            </w:tcMar>
-            <w:vAlign w:val="center"/>
-          </w:tcPr>
-          <w:p>
-            <w:r>
-              <w:rPr>
-                <w:color w:val="1E293B"/>
-                <w:sz w:val="18"/>
-                <w:szCs w:val="18"/>
-              </w:rPr>
-              <w:t xml:space="preserve">Administrator</w:t>
-            </w:r>
-          </w:p>
-        </w:tc>
-      </w:tr>
-      <w:tr>
-        <w:tc>
-          <w:tcPr>
-            <w:tcW w:w="3400" w:type="dxa"/>
-            <w:tcBorders>
-              <w:top w:val="single" w:sz="4" w:space="0" w:color="E2E8F0"/>
-              <w:left w:val="nil"/>
-              <w:bottom w:val="single" w:sz="4" w:space="0" w:color="E2E8F0"/>
-              <w:right w:val="nil"/>
-            </w:tcBorders>
-            <w:shd w:val="clear" w:color="auto" w:fill="F8FAFC"/>
-            <w:tcMar>
-              <w:top w:w="90" w:type="dxa"/>
-              <w:left w:w="160" w:type="dxa"/>
-              <w:bottom w:w="90" w:type="dxa"/>
-              <w:right w:w="160" w:type="dxa"/>
-            </w:tcMar>
-            <w:vAlign w:val="center"/>
-          </w:tcPr>
-          <w:p>
-            <w:r>
-              <w:rPr>
-                <w:color w:val="1E293B"/>
-                <w:sz w:val="18"/>
-                <w:szCs w:val="18"/>
-              </w:rPr>
-              <w:t xml:space="preserve">owner@rentalpro.com</w:t>
-            </w:r>
-          </w:p>
-        </w:tc>
-        <w:tc>
-          <w:tcPr>
-            <w:tcW w:w="2600" w:type="dxa"/>
-            <w:tcBorders>
-              <w:top w:val="single" w:sz="4" w:space="0" w:color="E2E8F0"/>
-              <w:left w:val="nil"/>
-              <w:bottom w:val="single" w:sz="4" w:space="0" w:color="E2E8F0"/>
-              <w:right w:val="nil"/>
-            </w:tcBorders>
-            <w:shd w:val="clear" w:color="auto" w:fill="F8FAFC"/>
-            <w:tcMar>
-              <w:top w:w="90" w:type="dxa"/>
-              <w:left w:w="160" w:type="dxa"/>
-              <w:bottom w:w="90" w:type="dxa"/>
-              <w:right w:w="160" w:type="dxa"/>
-            </w:tcMar>
-            <w:vAlign w:val="center"/>
-          </w:tcPr>
-          <w:p>
-            <w:r>
-              <w:rPr>
-                <w:color w:val="1E293B"/>
-                <w:sz w:val="18"/>
-                <w:szCs w:val="18"/>
-              </w:rPr>
-              <w:t xml:space="preserve">Tendai Moyo</w:t>
-            </w:r>
-          </w:p>
-        </w:tc>
-        <w:tc>
-          <w:tcPr>
-            <w:tcW w:w="3360" w:type="dxa"/>
-            <w:tcBorders>
-              <w:top w:val="single" w:sz="4" w:space="0" w:color="E2E8F0"/>
-              <w:left w:val="nil"/>
-              <w:bottom w:val="single" w:sz="4" w:space="0" w:color="E2E8F0"/>
-              <w:right w:val="nil"/>
-            </w:tcBorders>
-            <w:shd w:val="clear" w:color="auto" w:fill="F8FAFC"/>
-            <w:tcMar>
-              <w:top w:w="90" w:type="dxa"/>
-              <w:left w:w="160" w:type="dxa"/>
-              <w:bottom w:w="90" w:type="dxa"/>
-              <w:right w:w="160" w:type="dxa"/>
-            </w:tcMar>
-            <w:vAlign w:val="center"/>
-          </w:tcPr>
-          <w:p>
-            <w:r>
-              <w:rPr>
-                <w:color w:val="1E293B"/>
-                <w:sz w:val="18"/>
-                <w:szCs w:val="18"/>
-              </w:rPr>
-              <w:t xml:space="preserve">Property Owner</w:t>
-            </w:r>
-          </w:p>
-        </w:tc>
-      </w:tr>
-      <w:tr>
-        <w:tc>
-          <w:tcPr>
-            <w:tcW w:w="3400" w:type="dxa"/>
-            <w:tcBorders>
-              <w:top w:val="single" w:sz="4" w:space="0" w:color="E2E8F0"/>
-              <w:left w:val="nil"/>
-              <w:bottom w:val="single" w:sz="4" w:space="0" w:color="E2E8F0"/>
-              <w:right w:val="nil"/>
-            </w:tcBorders>
-            <w:shd w:val="clear" w:color="auto" w:fill="FFFFFF"/>
-            <w:tcMar>
-              <w:top w:w="90" w:type="dxa"/>
-              <w:left w:w="160" w:type="dxa"/>
-              <w:bottom w:w="90" w:type="dxa"/>
-              <w:right w:w="160" w:type="dxa"/>
-            </w:tcMar>
-            <w:vAlign w:val="center"/>
-          </w:tcPr>
-          <w:p>
-            <w:r>
-              <w:rPr>
-                <w:color w:val="1E293B"/>
-                <w:sz w:val="18"/>
-                <w:szCs w:val="18"/>
-              </w:rPr>
-              <w:t xml:space="preserve">manager@rentalpro.com</w:t>
-            </w:r>
-          </w:p>
-        </w:tc>
-        <w:tc>
-          <w:tcPr>
-            <w:tcW w:w="2600" w:type="dxa"/>
-            <w:tcBorders>
-              <w:top w:val="single" w:sz="4" w:space="0" w:color="E2E8F0"/>
-              <w:left w:val="nil"/>
-              <w:bottom w:val="single" w:sz="4" w:space="0" w:color="E2E8F0"/>
-              <w:right w:val="nil"/>
-            </w:tcBorders>
-            <w:shd w:val="clear" w:color="auto" w:fill="FFFFFF"/>
-            <w:tcMar>
-              <w:top w:w="90" w:type="dxa"/>
-              <w:left w:w="160" w:type="dxa"/>
-              <w:bottom w:w="90" w:type="dxa"/>
-              <w:right w:w="160" w:type="dxa"/>
-            </w:tcMar>
-            <w:vAlign w:val="center"/>
-          </w:tcPr>
-          <w:p>
-            <w:r>
-              <w:rPr>
-                <w:color w:val="1E293B"/>
-                <w:sz w:val="18"/>
-                <w:szCs w:val="18"/>
-              </w:rPr>
-              <w:t xml:space="preserve">Rutendo Chikore</w:t>
-            </w:r>
-          </w:p>
-        </w:tc>
-        <w:tc>
-          <w:tcPr>
-            <w:tcW w:w="3360" w:type="dxa"/>
-            <w:tcBorders>
-              <w:top w:val="single" w:sz="4" w:space="0" w:color="E2E8F0"/>
-              <w:left w:val="nil"/>
-              <w:bottom w:val="single" w:sz="4" w:space="0" w:color="E2E8F0"/>
-              <w:right w:val="nil"/>
-            </w:tcBorders>
-            <w:shd w:val="clear" w:color="auto" w:fill="FFFFFF"/>
-            <w:tcMar>
-              <w:top w:w="90" w:type="dxa"/>
-              <w:left w:w="160" w:type="dxa"/>
-              <w:bottom w:w="90" w:type="dxa"/>
-              <w:right w:w="160" w:type="dxa"/>
-            </w:tcMar>
-            <w:vAlign w:val="center"/>
-          </w:tcPr>
-          <w:p>
-            <w:r>
-              <w:rPr>
-                <w:color w:val="1E293B"/>
-                <w:sz w:val="18"/>
-                <w:szCs w:val="18"/>
-              </w:rPr>
-              <w:t xml:space="preserve">Property Manager</w:t>
-            </w:r>
-          </w:p>
-        </w:tc>
-      </w:tr>
-      <w:tr>
-        <w:tc>
-          <w:tcPr>
-            <w:tcW w:w="3400" w:type="dxa"/>
-            <w:tcBorders>
-              <w:top w:val="single" w:sz="4" w:space="0" w:color="E2E8F0"/>
-              <w:left w:val="nil"/>
-              <w:bottom w:val="single" w:sz="4" w:space="0" w:color="E2E8F0"/>
-              <w:right w:val="nil"/>
-            </w:tcBorders>
-            <w:shd w:val="clear" w:color="auto" w:fill="F8FAFC"/>
-            <w:tcMar>
-              <w:top w:w="90" w:type="dxa"/>
-              <w:left w:w="160" w:type="dxa"/>
-              <w:bottom w:w="90" w:type="dxa"/>
-              <w:right w:w="160" w:type="dxa"/>
-            </w:tcMar>
-            <w:vAlign w:val="center"/>
-          </w:tcPr>
-          <w:p>
-            <w:r>
-              <w:rPr>
-                <w:color w:val="1E293B"/>
-                <w:sz w:val="18"/>
-                <w:szCs w:val="18"/>
-              </w:rPr>
-              <w:t xml:space="preserve">staff@rentalpro.com</w:t>
-            </w:r>
-          </w:p>
-        </w:tc>
-        <w:tc>
-          <w:tcPr>
-            <w:tcW w:w="2600" w:type="dxa"/>
-            <w:tcBorders>
-              <w:top w:val="single" w:sz="4" w:space="0" w:color="E2E8F0"/>
-              <w:left w:val="nil"/>
-              <w:bottom w:val="single" w:sz="4" w:space="0" w:color="E2E8F0"/>
-              <w:right w:val="nil"/>
-            </w:tcBorders>
-            <w:shd w:val="clear" w:color="auto" w:fill="F8FAFC"/>
-            <w:tcMar>
-              <w:top w:w="90" w:type="dxa"/>
-              <w:left w:w="160" w:type="dxa"/>
-              <w:bottom w:w="90" w:type="dxa"/>
-              <w:right w:w="160" w:type="dxa"/>
-            </w:tcMar>
-            <w:vAlign w:val="center"/>
-          </w:tcPr>
-          <w:p>
-            <w:r>
-              <w:rPr>
-                <w:color w:val="1E293B"/>
-                <w:sz w:val="18"/>
-                <w:szCs w:val="18"/>
-              </w:rPr>
-              <w:t xml:space="preserve">Farai Ncube</w:t>
-            </w:r>
-          </w:p>
-        </w:tc>
-        <w:tc>
-          <w:tcPr>
-            <w:tcW w:w="3360" w:type="dxa"/>
-            <w:tcBorders>
-              <w:top w:val="single" w:sz="4" w:space="0" w:color="E2E8F0"/>
-              <w:left w:val="nil"/>
-              <w:bottom w:val="single" w:sz="4" w:space="0" w:color="E2E8F0"/>
-              <w:right w:val="nil"/>
-            </w:tcBorders>
-            <w:shd w:val="clear" w:color="auto" w:fill="F8FAFC"/>
-            <w:tcMar>
-              <w:top w:w="90" w:type="dxa"/>
-              <w:left w:w="160" w:type="dxa"/>
-              <w:bottom w:w="90" w:type="dxa"/>
-              <w:right w:w="160" w:type="dxa"/>
-            </w:tcMar>
-            <w:vAlign w:val="center"/>
-          </w:tcPr>
-          <w:p>
-            <w:r>
-              <w:rPr>
-                <w:color w:val="1E293B"/>
-                <w:sz w:val="18"/>
-                <w:szCs w:val="18"/>
-              </w:rPr>
-              <w:t xml:space="preserve">Maintenance Staff</w:t>
-            </w:r>
-          </w:p>
-        </w:tc>
-      </w:tr>
-      <w:tr>
-        <w:tc>
-          <w:tcPr>
-            <w:tcW w:w="3400" w:type="dxa"/>
-            <w:tcBorders>
-              <w:top w:val="single" w:sz="4" w:space="0" w:color="E2E8F0"/>
-              <w:left w:val="nil"/>
-              <w:bottom w:val="single" w:sz="4" w:space="0" w:color="E2E8F0"/>
-              <w:right w:val="nil"/>
-            </w:tcBorders>
-            <w:shd w:val="clear" w:color="auto" w:fill="FFFFFF"/>
-            <w:tcMar>
-              <w:top w:w="90" w:type="dxa"/>
-              <w:left w:w="160" w:type="dxa"/>
-              <w:bottom w:w="90" w:type="dxa"/>
-              <w:right w:w="160" w:type="dxa"/>
-            </w:tcMar>
-            <w:vAlign w:val="center"/>
-          </w:tcPr>
-          <w:p>
-            <w:r>
-              <w:rPr>
-                <w:color w:val="1E293B"/>
-                <w:sz w:val="18"/>
-                <w:szCs w:val="18"/>
-              </w:rPr>
-              <w:t xml:space="preserve">tenant1@email.com</w:t>
-            </w:r>
-          </w:p>
-        </w:tc>
-        <w:tc>
-          <w:tcPr>
-            <w:tcW w:w="2600" w:type="dxa"/>
-            <w:tcBorders>
-              <w:top w:val="single" w:sz="4" w:space="0" w:color="E2E8F0"/>
-              <w:left w:val="nil"/>
-              <w:bottom w:val="single" w:sz="4" w:space="0" w:color="E2E8F0"/>
-              <w:right w:val="nil"/>
-            </w:tcBorders>
-            <w:shd w:val="clear" w:color="auto" w:fill="FFFFFF"/>
-            <w:tcMar>
-              <w:top w:w="90" w:type="dxa"/>
-              <w:left w:w="160" w:type="dxa"/>
-              <w:bottom w:w="90" w:type="dxa"/>
-              <w:right w:w="160" w:type="dxa"/>
-            </w:tcMar>
-            <w:vAlign w:val="center"/>
-          </w:tcPr>
-          <w:p>
-            <w:r>
-              <w:rPr>
-                <w:color w:val="1E293B"/>
-                <w:sz w:val="18"/>
-                <w:szCs w:val="18"/>
-              </w:rPr>
-              <w:t xml:space="preserve">Chipo Mutasa</w:t>
-            </w:r>
-          </w:p>
-        </w:tc>
-        <w:tc>
-          <w:tcPr>
-            <w:tcW w:w="3360" w:type="dxa"/>
-            <w:tcBorders>
-              <w:top w:val="single" w:sz="4" w:space="0" w:color="E2E8F0"/>
-              <w:left w:val="nil"/>
-              <w:bottom w:val="single" w:sz="4" w:space="0" w:color="E2E8F0"/>
-              <w:right w:val="nil"/>
-            </w:tcBorders>
-            <w:shd w:val="clear" w:color="auto" w:fill="FFFFFF"/>
-            <w:tcMar>
-              <w:top w:w="90" w:type="dxa"/>
-              <w:left w:w="160" w:type="dxa"/>
-              <w:bottom w:w="90" w:type="dxa"/>
-              <w:right w:w="160" w:type="dxa"/>
-            </w:tcMar>
-            <w:vAlign w:val="center"/>
-          </w:tcPr>
-          <w:p>
-            <w:r>
-              <w:rPr>
-                <w:color w:val="1E293B"/>
-                <w:sz w:val="18"/>
-                <w:szCs w:val="18"/>
-              </w:rPr>
-              <w:t xml:space="preserve">Tenant (Avondale Heights, Unit 101)</w:t>
-            </w:r>
-          </w:p>
-        </w:tc>
-      </w:tr>
-      <w:tr>
-        <w:tc>
-          <w:tcPr>
-            <w:tcW w:w="3400" w:type="dxa"/>
-            <w:tcBorders>
-              <w:top w:val="single" w:sz="4" w:space="0" w:color="E2E8F0"/>
-              <w:left w:val="nil"/>
-              <w:bottom w:val="single" w:sz="4" w:space="0" w:color="E2E8F0"/>
-              <w:right w:val="nil"/>
-            </w:tcBorders>
-            <w:shd w:val="clear" w:color="auto" w:fill="F8FAFC"/>
-            <w:tcMar>
-              <w:top w:w="90" w:type="dxa"/>
-              <w:left w:w="160" w:type="dxa"/>
-              <w:bottom w:w="90" w:type="dxa"/>
-              <w:right w:w="160" w:type="dxa"/>
-            </w:tcMar>
-            <w:vAlign w:val="center"/>
-          </w:tcPr>
-          <w:p>
-            <w:r>
-              <w:rPr>
-                <w:color w:val="1E293B"/>
-                <w:sz w:val="18"/>
-                <w:szCs w:val="18"/>
-              </w:rPr>
-              <w:t xml:space="preserve">tenant2@email.com … tenant9@email.com</w:t>
-            </w:r>
-          </w:p>
-        </w:tc>
-        <w:tc>
-          <w:tcPr>
-            <w:tcW w:w="2600" w:type="dxa"/>
-            <w:tcBorders>
-              <w:top w:val="single" w:sz="4" w:space="0" w:color="E2E8F0"/>
-              <w:left w:val="nil"/>
-              <w:bottom w:val="single" w:sz="4" w:space="0" w:color="E2E8F0"/>
-              <w:right w:val="nil"/>
-            </w:tcBorders>
-            <w:shd w:val="clear" w:color="auto" w:fill="F8FAFC"/>
-            <w:tcMar>
-              <w:top w:w="90" w:type="dxa"/>
-              <w:left w:w="160" w:type="dxa"/>
-              <w:bottom w:w="90" w:type="dxa"/>
-              <w:right w:w="160" w:type="dxa"/>
-            </w:tcMar>
-            <w:vAlign w:val="center"/>
-          </w:tcPr>
-          <w:p>
-            <w:r>
-              <w:rPr>
-                <w:color w:val="1E293B"/>
-                <w:sz w:val="18"/>
-                <w:szCs w:val="18"/>
-              </w:rPr>
-              <w:t xml:space="preserve">Eight further Harare tenants</w:t>
-            </w:r>
-          </w:p>
-        </w:tc>
-        <w:tc>
-          <w:tcPr>
-            <w:tcW w:w="3360" w:type="dxa"/>
-            <w:tcBorders>
-              <w:top w:val="single" w:sz="4" w:space="0" w:color="E2E8F0"/>
-              <w:left w:val="nil"/>
-              <w:bottom w:val="single" w:sz="4" w:space="0" w:color="E2E8F0"/>
-              <w:right w:val="nil"/>
-            </w:tcBorders>
-            <w:shd w:val="clear" w:color="auto" w:fill="F8FAFC"/>
-            <w:tcMar>
-              <w:top w:w="90" w:type="dxa"/>
-              <w:left w:w="160" w:type="dxa"/>
-              <w:bottom w:w="90" w:type="dxa"/>
-              <w:right w:w="160" w:type="dxa"/>
-            </w:tcMar>
-            <w:vAlign w:val="center"/>
-          </w:tcPr>
-          <w:p>
-            <w:r>
-              <w:rPr>
-                <w:color w:val="1E293B"/>
-                <w:sz w:val="18"/>
-                <w:szCs w:val="18"/>
-              </w:rPr>
-              <w:t xml:space="preserve">Tenants across all five properties</w:t>
-            </w:r>
-          </w:p>
-        </w:tc>
-      </w:tr>
-    </w:tbl>
-    <w:p>
-      <w:pPr>
-        <w:spacing w:after="120"/>
-      </w:pPr>
     </w:p>
     <w:p>
       <w:pPr>

</xml_diff>